<commit_message>
fix: render readable and private demo artifacts
Co-authored-by: Copilot App <223556219+Copilot@users.noreply.github.com>
</commit_message>
<xml_diff>
--- a/examples/after.docx
+++ b/examples/after.docx
@@ -41,7 +41,7 @@
         <w:pStyle w:val="AppleAbstractZH"/>
       </w:pPr>
       <w:r>
-        <w:t>准确了解单株苹果树的叶片数量，有助于描述树冠生长状态并演示从局部观测推断总体规模的基本过程。本研究以一株虚构的盛果期苹果树为对象，提出一种结合树冠分层、方位样方、可见面积校正和重复抽样的叶片数量估算方法。研究首先将树冠划分为上、中、下三层，再在不同方位设置固定面积样方，对样方内完整叶片、边界叶片和被遮挡叶片分别记录；随后依据模拟摄影得到的可见面积比例修正局部计数，并按各层表面积权重进行外推。为检验方法稳定性，本文设置三轮重复观测，比较简单均值外推、分层加权外推与遮挡校正外推三种结果，同时通过留一层分析和确定性扰动计算敏感性区间。模拟结果表明，分层与遮挡校正可以降低树冠中层叶片密集造成的系统性低估；在设定的模拟条件下，推荐估计值为4286片，相对模拟真值4320片的偏差为-0.79%，重复观测变异系数为3.1%。研究还给出样方布设图、估算流程图、记录表和可复算公式，使演示数据能够沿着“原始记录—校正计数—分层外推—整树合计”的链条被核对。本文强调，所有树体参数、叶片计数、图表和结论均为模拟数据，仅服务于论文结构、图表、引文、附录和无障碍说明的完整演示，不代表任何真实试验或生产建议。该方法的意义在于提供一个逻辑闭合、步骤透明且适合教学复核的案例，而不是证明某种真实苹果树管理技术的优劣。</w:t>
+        <w:t>准确了解单株苹果树的叶片数量，有助于描述树冠生长状态并演示从局部观测推断总体规模的基本过程。本研究以一株虚构的盛果期苹果树为对象，提出一种结合树冠分层、方位样方、可见面积校正和重复抽样的叶片数量估算方法。研究首先将树冠划分为上、中、下三层，再在不同方位设置固定面积样方，对样方内完整叶片、边界叶片和被遮挡叶片分别记录；随后依据模拟摄影得到的可见面积比例修正局部计数，并按各层表面积权重进行外推。为检验方法稳定性，本文设置三轮重复观测，比较简单均值外推、分层加权外推与遮挡校正外推三种结果，同时通过留一层分析和确定性扰动计算敏感性区间。模拟结果表明，分层与遮挡校正可以降低树冠中层叶片密集造成的系统性低估；在设定的模拟条件下，推荐估计值为4286片，相对模拟真值4320片的偏差为-0.79%，重复观测变异系数为3.1%。研究还给出样方布设图、估算流程图、记录表和可复算公式，使演示数据能够沿着“原始记录—校正计数—分层外推—整树合计”的链条被核对。本文强调，所有树体参数、叶片计数、图表和结论均为模拟数据，仅服务于论文结构、图表、引文、附录和无障碍说明的完整演示，不代表任何真实试验或生产建议。该方法的意义在于提供一个逻辑闭合、步骤透明且适合教学复核的案例，而不是证明某种真实苹果树管理技术的优劣。数据声明：本文的树体、叶片、样方、观测记录、统计结果和误差指标均为为演示论文排版而构造的模拟数据，不代表任何真实果园、真实机构、真实人员或实际科研结论，不得用于生产决策。</w:t>
       </w:r>
     </w:p>
     <w:p>
@@ -97,7 +97,7 @@
         <w:fldChar w:fldCharType="separate"/>
       </w:r>
       <w:r>
-        <w:t>更新字段后显示</w:t>
+        <w:t/>
       </w:r>
       <w:r>
         <w:fldChar w:fldCharType="end"/>
@@ -122,7 +122,7 @@
         <w:fldChar w:fldCharType="separate"/>
       </w:r>
       <w:r>
-        <w:t>更新字段后显示</w:t>
+        <w:t/>
       </w:r>
       <w:r>
         <w:fldChar w:fldCharType="end"/>
@@ -147,7 +147,7 @@
         <w:fldChar w:fldCharType="separate"/>
       </w:r>
       <w:r>
-        <w:t>更新字段后显示</w:t>
+        <w:t/>
       </w:r>
       <w:r>
         <w:fldChar w:fldCharType="end"/>
@@ -205,14 +205,6 @@
     </w:p>
     <w:p>
       <w:pPr>
-        <w:pStyle w:val="AppleBody"/>
-      </w:pPr>
-      <w:r>
-        <w:t>为了让章节之间形成连续推理，本章提出的每个问题都在后文获得对应材料。空间代表性问题由第二章的三层六样方设计处理，遮挡问题由可见比例校正处理，结果可信度问题由第三章的方法比较和敏感性分析处理，误用风险则在第四章与附录中再次声明。这样的映射可防止绪论提出宏大目标而正文只完成局部计算。</w:t>
-      </w:r>
-    </w:p>
-    <w:p>
-      <w:pPr>
         <w:pStyle w:val="AppleHeading2"/>
         <w:numPr>
           <w:ilvl w:val="1"/>
@@ -237,14 +229,6 @@
       </w:pPr>
       <w:r>
         <w:t>已有的虚构教学文献把树冠测量分为几何包络、局部密度和器官计数三个层次，并指出局部密度必须与其代表面积相匹配[1]。据此，本文不把一个样方的平均数直接乘到整株，而是先承认不同高度的枝叶密度存在差异，再为各层分配独立权重。这样的安排既能说明分层抽样的必要性，也便于在后文逐层追踪误差来源。</w:t>
-      </w:r>
-    </w:p>
-    <w:p>
-      <w:pPr>
-        <w:pStyle w:val="AppleBody"/>
-      </w:pPr>
-      <w:r>
-        <w:t>本研究设定的核心问题包括三个方面：第一，怎样划分树冠才能兼顾操作简便与结构差异；第二，怎样处理边界叶片和遮挡叶片，避免不同观察者采用隐含规则；第三，怎样把局部计数外推为整树结果并给出可理解的不确定性。三个问题分别对应空间设计、记录规则和计算模型，任何一个环节缺失都会使最终数字难以解释。</w:t>
       </w:r>
     </w:p>
     <w:p>
@@ -277,14 +261,6 @@
     </w:p>
     <w:p>
       <w:pPr>
-        <w:pStyle w:val="AppleBody"/>
-      </w:pPr>
-      <w:r>
-        <w:t>本文有意采用较少但定义明确的变量。层别只设上、中、下三级，样方总数为六个，每轮观测使用相同位置；可见比例按层确定，表面积权重之和严格等于一。简化并非声称真实树冠只有这些特征，而是为了让每一项假设都能在有限篇幅中被检查，并为后续排版演示提供稳定内容。</w:t>
-      </w:r>
-    </w:p>
-    <w:p>
-      <w:pPr>
         <w:pStyle w:val="AppleHeading2"/>
         <w:numPr>
           <w:ilvl w:val="1"/>
@@ -313,14 +289,6 @@
     </w:p>
     <w:p>
       <w:pPr>
-        <w:pStyle w:val="AppleBody"/>
-      </w:pPr>
-      <w:r>
-        <w:t>数据声明：本文的树体、叶片、样方、观测记录、统计结果和误差指标均为为演示论文排版而构造的模拟数据，不代表任何真实果园、真实机构、真实人员或实际科研结论，不得用于生产决策。</w:t>
-      </w:r>
-    </w:p>
-    <w:p>
-      <w:pPr>
         <w:pStyle w:val="AppleHeading1"/>
         <w:numPr>
           <w:ilvl w:val="0"/>
@@ -337,14 +305,6 @@
       </w:pPr>
       <w:r>
         <w:t>材料设定采用“参数表先于结果表”的组织方式。树高、冠幅、样方面积、层权重和可见比例在查看估算结果之前即被固定，后续计算不得因偏差大小而修改这些输入。若需要展示另一套假设，应建立新的模拟情景并保留原情景，而不是覆盖数值。该原则使表2-1既是方法说明，也是防止事后调参的版本边界。</w:t>
-      </w:r>
-    </w:p>
-    <w:p>
-      <w:pPr>
-        <w:pStyle w:val="AppleBody"/>
-      </w:pPr>
-      <w:r>
-        <w:t>六个样方的角色并不相同。上层样方主要检验稀疏区域是否被整体平均掩盖，中层样方承载高密度与强遮挡的组合，下层样方用于观察较大表面积但较低局部密度的贡献。方向交错则避免某一侧在每一层重复出现。尽管这些安排来自虚构设定，它们仍展示了抽样设计应让每个位置具有明确代表对象，而不是只追求记录数量。</w:t>
       </w:r>
     </w:p>
     <w:p>
@@ -373,14 +333,6 @@
       </w:pPr>
       <w:r>
         <w:t>模拟数据生成分两步。第一步依据预设层权重建立无观测误差的潜在叶量，第二步施加遮挡、边界判定和小幅重复计数差异。虚构方法手册建议在演示中分离“总体结构参数”和“观察过程参数”，以免把树体差异误写成计数误差[2]。本文因此分别保存表面积权重、可见比例和轮次扰动。</w:t>
-      </w:r>
-    </w:p>
-    <w:p>
-      <w:pPr>
-        <w:pStyle w:val="AppleBody"/>
-      </w:pPr>
-      <w:r>
-        <w:t>三轮观测的扰动采用固定序列而非随机抽样，以保证每次构建演示文档都得到相同结果。第一轮略低估中层，第二轮接近设定均值，第三轮略高估下层。确定性设置牺牲了对随机过程的逼真模拟，却换来可重复的测试条件，符合本项目验证排版、引用、图像和表格完整性的目的。</w:t>
       </w:r>
     </w:p>
     <w:p>
@@ -892,22 +844,6 @@
     </w:p>
     <w:p>
       <w:pPr>
-        <w:pStyle w:val="AppleBody"/>
-      </w:pPr>
-      <w:r>
-        <w:t>表2-1列出后续计算需要的全部层级参数。表面积权重0.24、0.46和0.30之和为1；可见比例分别为0.91、0.82和0.88。中层可见比例最低，与其叶片密集、交叠较多的设定一致。样方数和面积保持一致，使层间比较主要反映密度与可见性，而不是不同的抽样投入。</w:t>
-      </w:r>
-    </w:p>
-    <w:p>
-      <w:pPr>
-        <w:pStyle w:val="AppleBody"/>
-      </w:pPr>
-      <w:r>
-        <w:t>每个样方在观察前被划分为四个相等子区，记录顺序固定为左上、右上、左下、右下。固定顺序可减少跳跃计数和重复计数，子区小计相加后必须与样方总计一致。若发现不一致，记录不进入外推，而是返回原始标记逐项核对。该规则把简单的算术校验嵌入现场记录流程。</w:t>
-      </w:r>
-    </w:p>
-    <w:p>
-      <w:pPr>
         <w:pStyle w:val="AppleHeading2"/>
         <w:numPr>
           <w:ilvl w:val="1"/>
@@ -936,22 +872,6 @@
     </w:p>
     <w:p>
       <w:pPr>
-        <w:pStyle w:val="AppleBody"/>
-      </w:pPr>
-      <w:r>
-        <w:t>质量控制包括四项：子区和与样方总计一致；六个样方编号齐全且不重复；可见比例位于0与1之间；轮次变化超过15%时触发复核。复核只检查抄录、边界和遮挡标签，不以接近预设真值为目标。这样可避免为了获得“好看结果”而反向调整原始记录。</w:t>
-      </w:r>
-    </w:p>
-    <w:p>
-      <w:pPr>
-        <w:pStyle w:val="AppleBody"/>
-      </w:pPr>
-      <w:r>
-        <w:t>完成核对后，记录按“树号—层别—方位—轮次—子区”形成唯一键。附录给出字段说明和一组复算样例。任何汇总值都应能回到唯一键对应的原始条目；若只能找到表格总数而找不到局部来源，则该结果不被视为可审计数据。</w:t>
-      </w:r>
-    </w:p>
-    <w:p>
-      <w:pPr>
         <w:pStyle w:val="AppleHeading1"/>
         <w:numPr>
           <w:ilvl w:val="0"/>
@@ -968,14 +888,6 @@
       </w:pPr>
       <w:r>
         <w:t>计算实现遵守从原始量到派生量的单向顺序。原始量包括子区计数、样方面积与层级标签；参数量包括层权重和可见比例；派生量依次为样方总计、基础密度、校正密度、层平均、层贡献和整树估计。任何派生量都不作为更早步骤的输入。按这一顺序保存记录，既方便人工复算，也便于后续软件为每个字段建立类型与范围校验。</w:t>
-      </w:r>
-    </w:p>
-    <w:p>
-      <w:pPr>
-        <w:pStyle w:val="AppleBody"/>
-      </w:pPr>
-      <w:r>
-        <w:t>结果解释刻意区分“改善案例内偏差”和“证明方法普遍有效”。遮挡校正的偏差较小，是因为模拟生成过程确实包含了相应遮挡机制；如果生成机制改变，排序也可能改变。因此，表3-1只能说明三个模型在同一设定中的行为。把这一限制写入正文，可帮助演示论文保留科学语气，而不把内部一致性夸大为外部有效性。</w:t>
       </w:r>
     </w:p>
     <w:p>
@@ -1004,22 +916,6 @@
       </w:pPr>
       <w:r>
         <w:t>分层叶量由层平均密度、整株等效面积尺度和层权重共同确定。本案例把整株等效尺度固定为11.004869 m²，并与0.25 m²样方面积、三层权重及可见比例一并列入附录表A-3。虚构统计说明建议在教学案例中保留归一化步骤，因为它能明确权重只分配总体而不凭空增加观测信息[4]。</w:t>
-      </w:r>
-    </w:p>
-    <w:p>
-      <w:pPr>
-        <w:pStyle w:val="AppleBody"/>
-      </w:pPr>
-      <w:r>
-        <w:t>简单均值外推忽略层别和遮挡，把六个样方的基础密度平均后扩展到整树；分层加权外推使用层权重但不做可见比例校正；遮挡校正外推同时使用两类参数。三种方法共享同一组原始记录，差异只来自模型假设，因此表3-1中的结果可用于观察每个附加步骤带来的变化。</w:t>
-      </w:r>
-    </w:p>
-    <w:p>
-      <w:pPr>
-        <w:pStyle w:val="AppleBody"/>
-      </w:pPr>
-      <w:r>
-        <w:t>最终推荐值采用三轮遮挡校正结果的算术平均并四舍五入到整数片。中间计算保留两位小数，最后一步才取整，避免逐层取整误差累积。估计值4286片与模拟真值4320片相差34片，偏差为-0.79%。由于输入是固定模拟序列，这一偏差只描述案例内部表现，不能外推到真实测量。</w:t>
       </w:r>
     </w:p>
     <w:p>
@@ -1466,22 +1362,6 @@
     </w:p>
     <w:p>
       <w:pPr>
-        <w:pStyle w:val="AppleBody"/>
-      </w:pPr>
-      <w:r>
-        <w:t>图3-1把计算流程划分为四个主步骤和一个误差评估回路。箭头表示数据处理顺序，不表示因果证明。每一步都产生可保存的中间结果：分层编号表、样方计数表、校正密度表和分层外推表。保存中间结果能够定位异常来自输入、参数还是公式，而不是在最终总数出现偏差时重新检查全部过程。</w:t>
-      </w:r>
-    </w:p>
-    <w:p>
-      <w:pPr>
-        <w:pStyle w:val="AppleBody"/>
-      </w:pPr>
-      <w:r>
-        <w:t>结果报告采用整数叶片数，同时保留百分比指标。整数便于回答研究问题，百分比便于跨方法比较。两种表达必须同时解释：4286片看似精确，但其合理含义是当前模拟规则下的中心估计；3.1%的重复变异和后续敏感性区间提醒读者，该数字周围仍存在方法不确定性。</w:t>
-      </w:r>
-    </w:p>
-    <w:p>
-      <w:pPr>
         <w:pStyle w:val="AppleHeading2"/>
         <w:numPr>
           <w:ilvl w:val="1"/>
@@ -1538,22 +1418,6 @@
     </w:p>
     <w:p>
       <w:pPr>
-        <w:pStyle w:val="AppleBody"/>
-      </w:pPr>
-      <w:r>
-        <w:t>讨论部分把可复算性视为结论的一部分，而不是排版附件。一个数字若缺少输入版本、边界口径和中间步骤，即使恰好接近模拟真值，也不能说明方法可靠。相反，具有清楚误差来源的轻微偏差更适合作为教学材料，因为读者能够提出具体改进。本文因此保留三种方法的差异，不把较差结果从报告中删除。</w:t>
-      </w:r>
-    </w:p>
-    <w:p>
-      <w:pPr>
-        <w:pStyle w:val="AppleBody"/>
-      </w:pPr>
-      <w:r>
-        <w:t>本案例还强调内容安全与隐私边界。题名聚焦一般性的苹果树叶片估算，机构只使用明确虚构的苹果大学，人物以功能性小组名称出现，地点使用演示城，参考资料均标明虚构出版物。数据声明覆盖摘要、正文、表注、附录和致谢，使任何常见章节被单独查看时仍能辨认其模拟性质。这种冗余是有意的风险控制。</w:t>
-      </w:r>
-    </w:p>
-    <w:p>
-      <w:pPr>
         <w:pStyle w:val="AppleHeading2"/>
         <w:numPr>
           <w:ilvl w:val="1"/>
@@ -1582,14 +1446,6 @@
     </w:p>
     <w:p>
       <w:pPr>
-        <w:pStyle w:val="AppleBody"/>
-      </w:pPr>
-      <w:r>
-        <w:t>若把流程迁移到真实研究，应先通过独立破坏性清点或高质量成像建立验证样本，再估计可见比例并检验层权重；还应随机化样方位置、增加树体数量、记录观察者身份，并使用适合重复测量的统计模型。当前案例只提供字段和逻辑骨架，不提供可直接采用的参数。</w:t>
-      </w:r>
-    </w:p>
-    <w:p>
-      <w:pPr>
         <w:pStyle w:val="AppleHeading2"/>
         <w:numPr>
           <w:ilvl w:val="1"/>
@@ -1605,23 +1461,7 @@
         <w:pStyle w:val="AppleBody"/>
       </w:pPr>
       <w:r>
-        <w:t>作为论文内容演示，本案例同时包含双语题名与摘要、关键词、分级标题、连续图表编号、顺序引文、完整参考文献、附录和致谢。主题与数字保持内部一致，使排版测试不必依赖无意义占位文本。图像带有中文标签和替代文本，表格带有模拟注记，有助于检验文档的无障碍与隐私声明。</w:t>
-      </w:r>
-    </w:p>
-    <w:p>
-      <w:pPr>
-        <w:pStyle w:val="AppleBody"/>
-      </w:pPr>
-      <w:r>
         <w:t>虚构开放教学规范提出，演示资料应同时标明来源性质、复算路径和禁止误用范围[6]。本文把模拟声明放在摘要、正文、表注和附录中，并避免使用真实人员、真实机构或真实果园名称。重复声明并非赘余，而是为了使被单独复制的图表或段落仍保留必要语境。</w:t>
-      </w:r>
-    </w:p>
-    <w:p>
-      <w:pPr>
-        <w:pStyle w:val="AppleBody"/>
-      </w:pPr>
-      <w:r>
-        <w:t>后续改进可以增加机器可读的原始记录文件、公式单元测试和自动图表编号，但不应为了展示技术而扩大无关范围。对内容本身而言，可增加不同树冠形态的对照模拟，检验固定三层结构何时失效；对呈现而言，可在生成文档后自动检查标题层级、图像尺寸、表格边框、交叉引用和分页位置。</w:t>
       </w:r>
     </w:p>
     <w:p>
@@ -1642,22 +1482,6 @@
       </w:pPr>
       <w:r>
         <w:t>第一，针对本案例设定的空间异质性，树冠上、中、下分层比整冠简单平均更能保持局部记录与代表范围的对应关系。第二，可见比例校正弥补了中层叶片重叠造成的模拟低估，使结果从4172片调整为4286片。第三，重复观测与参数扰动表明，单一整数必须与变异指标和适用边界共同报告。</w:t>
-      </w:r>
-    </w:p>
-    <w:p>
-      <w:pPr>
-        <w:pStyle w:val="AppleBody"/>
-      </w:pPr>
-      <w:r>
-        <w:t>第四，完整估算链条需要的不只是公式，还包括稳定编号、边界规则、中间表、图示、数据声明和复算附录。只报告最终总数无法判断误差来自抽样、识别还是外推。本文的结构化内容把这些要素集中到一个虚构主题中，可用于后续生成约十二至十五页的演示论文并验证格式处理流程。</w:t>
-      </w:r>
-    </w:p>
-    <w:p>
-      <w:pPr>
-        <w:pStyle w:val="AppleBody"/>
-      </w:pPr>
-      <w:r>
-        <w:t>综上，分层样方与遮挡校正构成了一个逻辑闭合的单株叶片估算演示方案，但所得数值没有现实农业证据效力。研究目的已经达到：建立可读、可算、可检查且明确标注为模拟的论文内容，为文档格式与语义完整性测试提供稳定材料。</w:t>
       </w:r>
     </w:p>
     <w:p>
@@ -1797,54 +1621,6 @@
     </w:p>
     <w:p>
       <w:pPr>
-        <w:pStyle w:val="AppleBody"/>
-      </w:pPr>
-      <w:r>
-        <w:t>数据使用限制：这些记录专门用于演示论文生成、格式审查和自动化测试。它们不对应真实树木或真实观测，不可与现实果园数据合并，不可用于产量、施肥、修剪、病虫害或其他农业决策。复制本附录时应保留本段及表格的模拟注记。</w:t>
-      </w:r>
-    </w:p>
-    <w:p>
-      <w:pPr>
-        <w:pStyle w:val="AppleBody"/>
-      </w:pPr>
-      <w:r>
-        <w:t>轮次复算时，应为每一轮分别完成六个样方的校正与分层汇总，不能先把不同轮次的原始计数混合平均。前一种顺序保留轮次差异，能够计算重复变异；后一种顺序会在进入误差评估前抹平变化。若生成文档展示公式，分子、分母、单位和取整位置应与本说明一致，并在结果旁保留“片”作为计数单位。</w:t>
-      </w:r>
-    </w:p>
-    <w:p>
-      <w:pPr>
-        <w:pStyle w:val="AppleBody"/>
-      </w:pPr>
-      <w:r>
-        <w:t>表格审查时，应确认标题中的编号与正文引用一致、表头能够独立说明字段、每行列数相同、模拟注记未被分页遗漏。图像审查时，应确认宽高比未被拉伸、中文标签可辨认、替代文本说明信息关系而不只是重复标题。上述检查服务于文档质量，不改变任何模拟数值。</w:t>
-      </w:r>
-    </w:p>
-    <w:p>
-      <w:pPr>
-        <w:pStyle w:val="AppleBody"/>
-      </w:pPr>
-      <w:r>
-        <w:t>引用审查采用顺序覆盖规则：正文第一次出现的编号依次从1到6，每个编号恰好对应参考文献表中的一条完整记录，参考文献表不保留未被正文引用的项目。由于六条资料均为虚构，读者不应尝试在外部数据库检索；其作用是检验引文标记、文后列表和交叉对应是否完整。</w:t>
-      </w:r>
-    </w:p>
-    <w:p>
-      <w:pPr>
-        <w:pStyle w:val="AppleBody"/>
-      </w:pPr>
-      <w:r>
-        <w:t>若后续渲染需要分页，可优先在章标题、图题、表题和附录标题前设置保持段落关系，而不通过插入大量空行控制版面。预计双语摘要、四章正文、两幅图、两张主表、参考文献、致谢和附录共同形成约十二至十五页内容；实际页数仍取决于模板字号、行距、页边距和图像缩放。</w:t>
-      </w:r>
-    </w:p>
-    <w:p>
-      <w:pPr>
-        <w:pStyle w:val="AppleBody"/>
-      </w:pPr>
-      <w:r>
-        <w:t>最终交付前还应进行一次端到端核对：题名中的研究对象应始终为单株苹果树，摘要中的4286片、4320片、-0.79%和3.1%应与表3-1及结论一致，图2-1应只说明抽样空间，图3-1应只说明计算流程，附录示例应使用表2-1中的0.25 m²与0.82。若任一数字被修改，与之关联的摘要、正文、表格和复算说明都必须同步更新，不能只修正最先发现的位置。完成核对后，应再次生成两幅图片并比较文件摘要，确认相同输入得到相同PNG字节；还应重新扫描全部引文编号，防止内容扩写意外引入未列出的引用。这样，内容一致性、图像确定性与参考文献完整性可在同一轮验收中得到确认。</w:t>
-      </w:r>
-    </w:p>
-    <w:p>
-      <w:pPr>
         <w:pStyle w:val="AppleTableCaption"/>
       </w:pPr>
       <w:r>
@@ -1919,10 +1695,13 @@
           <w:p>
             <w:pPr>
               <w:pStyle w:val="AppleTableBody"/>
-              <w:spacing w:line="220" w:lineRule="exact"/>
+              <w:spacing w:line="170" w:lineRule="exact" w:before="0" w:after="0"/>
             </w:pPr>
             <w:r/>
             <w:r>
+              <w:rPr>
+                <w:sz w:val="15"/>
+              </w:rPr>
               <w:t>字段</w:t>
             </w:r>
           </w:p>
@@ -1938,10 +1717,13 @@
           <w:p>
             <w:pPr>
               <w:pStyle w:val="AppleTableBody"/>
-              <w:spacing w:line="220" w:lineRule="exact"/>
+              <w:spacing w:line="170" w:lineRule="exact" w:before="0" w:after="0"/>
             </w:pPr>
             <w:r/>
             <w:r>
+              <w:rPr>
+                <w:sz w:val="15"/>
+              </w:rPr>
               <w:t>类型</w:t>
             </w:r>
           </w:p>
@@ -1957,10 +1739,13 @@
           <w:p>
             <w:pPr>
               <w:pStyle w:val="AppleTableBody"/>
-              <w:spacing w:line="220" w:lineRule="exact"/>
+              <w:spacing w:line="170" w:lineRule="exact" w:before="0" w:after="0"/>
             </w:pPr>
             <w:r/>
             <w:r>
+              <w:rPr>
+                <w:sz w:val="15"/>
+              </w:rPr>
               <w:t>示例</w:t>
             </w:r>
           </w:p>
@@ -1976,10 +1761,13 @@
           <w:p>
             <w:pPr>
               <w:pStyle w:val="AppleTableBody"/>
-              <w:spacing w:line="220" w:lineRule="exact"/>
+              <w:spacing w:line="170" w:lineRule="exact" w:before="0" w:after="0"/>
             </w:pPr>
             <w:r/>
             <w:r>
+              <w:rPr>
+                <w:sz w:val="15"/>
+              </w:rPr>
               <w:t>校验规则</w:t>
             </w:r>
           </w:p>
@@ -1996,10 +1784,13 @@
           <w:p>
             <w:pPr>
               <w:pStyle w:val="AppleTableBody"/>
-              <w:spacing w:line="220" w:lineRule="exact"/>
+              <w:spacing w:line="170" w:lineRule="exact" w:before="0" w:after="0"/>
             </w:pPr>
             <w:r/>
             <w:r>
+              <w:rPr>
+                <w:sz w:val="15"/>
+              </w:rPr>
               <w:t>树号</w:t>
             </w:r>
           </w:p>
@@ -2011,10 +1802,13 @@
           <w:p>
             <w:pPr>
               <w:pStyle w:val="AppleTableBody"/>
-              <w:spacing w:line="220" w:lineRule="exact"/>
+              <w:spacing w:line="170" w:lineRule="exact" w:before="0" w:after="0"/>
             </w:pPr>
             <w:r/>
             <w:r>
+              <w:rPr>
+                <w:sz w:val="15"/>
+              </w:rPr>
               <w:t>文本</w:t>
             </w:r>
           </w:p>
@@ -2026,10 +1820,13 @@
           <w:p>
             <w:pPr>
               <w:pStyle w:val="AppleTableBody"/>
-              <w:spacing w:line="220" w:lineRule="exact"/>
+              <w:spacing w:line="170" w:lineRule="exact" w:before="0" w:after="0"/>
             </w:pPr>
             <w:r/>
             <w:r>
+              <w:rPr>
+                <w:sz w:val="15"/>
+              </w:rPr>
               <w:t>AU-APPLE-SIM-01</w:t>
             </w:r>
           </w:p>
@@ -2041,10 +1838,13 @@
           <w:p>
             <w:pPr>
               <w:pStyle w:val="AppleTableBody"/>
-              <w:spacing w:line="220" w:lineRule="exact"/>
+              <w:spacing w:line="170" w:lineRule="exact" w:before="0" w:after="0"/>
             </w:pPr>
             <w:r/>
             <w:r>
+              <w:rPr>
+                <w:sz w:val="15"/>
+              </w:rPr>
               <w:t>固定虚构标识</w:t>
             </w:r>
           </w:p>
@@ -2061,10 +1861,13 @@
           <w:p>
             <w:pPr>
               <w:pStyle w:val="AppleTableBody"/>
-              <w:spacing w:line="220" w:lineRule="exact"/>
+              <w:spacing w:line="170" w:lineRule="exact" w:before="0" w:after="0"/>
             </w:pPr>
             <w:r/>
             <w:r>
+              <w:rPr>
+                <w:sz w:val="15"/>
+              </w:rPr>
               <w:t>层别</w:t>
             </w:r>
           </w:p>
@@ -2076,10 +1879,13 @@
           <w:p>
             <w:pPr>
               <w:pStyle w:val="AppleTableBody"/>
-              <w:spacing w:line="220" w:lineRule="exact"/>
+              <w:spacing w:line="170" w:lineRule="exact" w:before="0" w:after="0"/>
             </w:pPr>
             <w:r/>
             <w:r>
+              <w:rPr>
+                <w:sz w:val="15"/>
+              </w:rPr>
               <w:t>枚举</w:t>
             </w:r>
           </w:p>
@@ -2091,10 +1897,13 @@
           <w:p>
             <w:pPr>
               <w:pStyle w:val="AppleTableBody"/>
-              <w:spacing w:line="220" w:lineRule="exact"/>
+              <w:spacing w:line="170" w:lineRule="exact" w:before="0" w:after="0"/>
             </w:pPr>
             <w:r/>
             <w:r>
+              <w:rPr>
+                <w:sz w:val="15"/>
+              </w:rPr>
               <w:t>中层</w:t>
             </w:r>
           </w:p>
@@ -2106,10 +1915,13 @@
           <w:p>
             <w:pPr>
               <w:pStyle w:val="AppleTableBody"/>
-              <w:spacing w:line="220" w:lineRule="exact"/>
+              <w:spacing w:line="170" w:lineRule="exact" w:before="0" w:after="0"/>
             </w:pPr>
             <w:r/>
             <w:r>
+              <w:rPr>
+                <w:sz w:val="15"/>
+              </w:rPr>
               <w:t>上层/中层/下层</w:t>
             </w:r>
           </w:p>
@@ -2126,10 +1938,13 @@
           <w:p>
             <w:pPr>
               <w:pStyle w:val="AppleTableBody"/>
-              <w:spacing w:line="220" w:lineRule="exact"/>
+              <w:spacing w:line="170" w:lineRule="exact" w:before="0" w:after="0"/>
             </w:pPr>
             <w:r/>
             <w:r>
+              <w:rPr>
+                <w:sz w:val="15"/>
+              </w:rPr>
               <w:t>轮次</w:t>
             </w:r>
           </w:p>
@@ -2141,10 +1956,13 @@
           <w:p>
             <w:pPr>
               <w:pStyle w:val="AppleTableBody"/>
-              <w:spacing w:line="220" w:lineRule="exact"/>
+              <w:spacing w:line="170" w:lineRule="exact" w:before="0" w:after="0"/>
             </w:pPr>
             <w:r/>
             <w:r>
+              <w:rPr>
+                <w:sz w:val="15"/>
+              </w:rPr>
               <w:t>枚举</w:t>
             </w:r>
           </w:p>
@@ -2156,10 +1974,13 @@
           <w:p>
             <w:pPr>
               <w:pStyle w:val="AppleTableBody"/>
-              <w:spacing w:line="220" w:lineRule="exact"/>
+              <w:spacing w:line="170" w:lineRule="exact" w:before="0" w:after="0"/>
             </w:pPr>
             <w:r/>
             <w:r>
+              <w:rPr>
+                <w:sz w:val="15"/>
+              </w:rPr>
               <w:t>R2</w:t>
             </w:r>
           </w:p>
@@ -2171,10 +1992,13 @@
           <w:p>
             <w:pPr>
               <w:pStyle w:val="AppleTableBody"/>
-              <w:spacing w:line="220" w:lineRule="exact"/>
+              <w:spacing w:line="170" w:lineRule="exact" w:before="0" w:after="0"/>
             </w:pPr>
             <w:r/>
             <w:r>
+              <w:rPr>
+                <w:sz w:val="15"/>
+              </w:rPr>
               <w:t>R1/R2/R3</w:t>
             </w:r>
           </w:p>
@@ -2191,10 +2015,13 @@
           <w:p>
             <w:pPr>
               <w:pStyle w:val="AppleTableBody"/>
-              <w:spacing w:line="220" w:lineRule="exact"/>
+              <w:spacing w:line="170" w:lineRule="exact" w:before="0" w:after="0"/>
             </w:pPr>
             <w:r/>
             <w:r>
+              <w:rPr>
+                <w:sz w:val="15"/>
+              </w:rPr>
               <w:t>可见比例</w:t>
             </w:r>
           </w:p>
@@ -2206,10 +2033,13 @@
           <w:p>
             <w:pPr>
               <w:pStyle w:val="AppleTableBody"/>
-              <w:spacing w:line="220" w:lineRule="exact"/>
+              <w:spacing w:line="170" w:lineRule="exact" w:before="0" w:after="0"/>
             </w:pPr>
             <w:r/>
             <w:r>
+              <w:rPr>
+                <w:sz w:val="15"/>
+              </w:rPr>
               <w:t>小数</w:t>
             </w:r>
           </w:p>
@@ -2221,10 +2051,13 @@
           <w:p>
             <w:pPr>
               <w:pStyle w:val="AppleTableBody"/>
-              <w:spacing w:line="220" w:lineRule="exact"/>
+              <w:spacing w:line="170" w:lineRule="exact" w:before="0" w:after="0"/>
             </w:pPr>
             <w:r/>
             <w:r>
+              <w:rPr>
+                <w:sz w:val="15"/>
+              </w:rPr>
               <w:t>0.82</w:t>
             </w:r>
           </w:p>
@@ -2236,10 +2069,13 @@
           <w:p>
             <w:pPr>
               <w:pStyle w:val="AppleTableBody"/>
-              <w:spacing w:line="220" w:lineRule="exact"/>
+              <w:spacing w:line="170" w:lineRule="exact" w:before="0" w:after="0"/>
             </w:pPr>
             <w:r/>
             <w:r>
+              <w:rPr>
+                <w:sz w:val="15"/>
+              </w:rPr>
               <w:t>大于0且不大于1</w:t>
             </w:r>
           </w:p>
@@ -2256,10 +2092,13 @@
           <w:p>
             <w:pPr>
               <w:pStyle w:val="AppleTableBody"/>
-              <w:spacing w:line="220" w:lineRule="exact"/>
+              <w:spacing w:line="170" w:lineRule="exact" w:before="0" w:after="0"/>
             </w:pPr>
             <w:r/>
             <w:r>
+              <w:rPr>
+                <w:sz w:val="15"/>
+              </w:rPr>
               <w:t>基础计数</w:t>
             </w:r>
           </w:p>
@@ -2271,10 +2110,13 @@
           <w:p>
             <w:pPr>
               <w:pStyle w:val="AppleTableBody"/>
-              <w:spacing w:line="220" w:lineRule="exact"/>
+              <w:spacing w:line="170" w:lineRule="exact" w:before="0" w:after="0"/>
             </w:pPr>
             <w:r/>
             <w:r>
+              <w:rPr>
+                <w:sz w:val="15"/>
+              </w:rPr>
               <w:t>整数</w:t>
             </w:r>
           </w:p>
@@ -2286,10 +2128,13 @@
           <w:p>
             <w:pPr>
               <w:pStyle w:val="AppleTableBody"/>
-              <w:spacing w:line="220" w:lineRule="exact"/>
+              <w:spacing w:line="170" w:lineRule="exact" w:before="0" w:after="0"/>
             </w:pPr>
             <w:r/>
             <w:r>
+              <w:rPr>
+                <w:sz w:val="15"/>
+              </w:rPr>
               <w:t>94</w:t>
             </w:r>
           </w:p>
@@ -2301,10 +2146,13 @@
           <w:p>
             <w:pPr>
               <w:pStyle w:val="AppleTableBody"/>
-              <w:spacing w:line="220" w:lineRule="exact"/>
+              <w:spacing w:line="170" w:lineRule="exact" w:before="0" w:after="0"/>
             </w:pPr>
             <w:r/>
             <w:r>
+              <w:rPr>
+                <w:sz w:val="15"/>
+              </w:rPr>
               <w:t>非负且等于子区和</w:t>
             </w:r>
           </w:p>
@@ -2401,10 +2249,13 @@
           <w:p>
             <w:pPr>
               <w:pStyle w:val="AppleTableBody"/>
-              <w:spacing w:line="220" w:lineRule="exact"/>
+              <w:spacing w:line="170" w:lineRule="exact" w:before="0" w:after="0"/>
             </w:pPr>
             <w:r/>
             <w:r>
+              <w:rPr>
+                <w:sz w:val="15"/>
+              </w:rPr>
               <w:t>轮次</w:t>
             </w:r>
           </w:p>
@@ -2420,10 +2271,13 @@
           <w:p>
             <w:pPr>
               <w:pStyle w:val="AppleTableBody"/>
-              <w:spacing w:line="220" w:lineRule="exact"/>
+              <w:spacing w:line="170" w:lineRule="exact" w:before="0" w:after="0"/>
             </w:pPr>
             <w:r/>
             <w:r>
+              <w:rPr>
+                <w:sz w:val="15"/>
+              </w:rPr>
               <w:t>样方</w:t>
             </w:r>
           </w:p>
@@ -2439,10 +2293,13 @@
           <w:p>
             <w:pPr>
               <w:pStyle w:val="AppleTableBody"/>
-              <w:spacing w:line="220" w:lineRule="exact"/>
+              <w:spacing w:line="170" w:lineRule="exact" w:before="0" w:after="0"/>
             </w:pPr>
             <w:r/>
             <w:r>
+              <w:rPr>
+                <w:sz w:val="15"/>
+              </w:rPr>
               <w:t>层别</w:t>
             </w:r>
           </w:p>
@@ -2458,10 +2315,13 @@
           <w:p>
             <w:pPr>
               <w:pStyle w:val="AppleTableBody"/>
-              <w:spacing w:line="220" w:lineRule="exact"/>
+              <w:spacing w:line="170" w:lineRule="exact" w:before="0" w:after="0"/>
             </w:pPr>
             <w:r/>
             <w:r>
+              <w:rPr>
+                <w:sz w:val="15"/>
+              </w:rPr>
               <w:t>方位</w:t>
             </w:r>
           </w:p>
@@ -2477,10 +2337,13 @@
           <w:p>
             <w:pPr>
               <w:pStyle w:val="AppleTableBody"/>
-              <w:spacing w:line="220" w:lineRule="exact"/>
+              <w:spacing w:line="170" w:lineRule="exact" w:before="0" w:after="0"/>
             </w:pPr>
             <w:r/>
             <w:r>
+              <w:rPr>
+                <w:sz w:val="15"/>
+              </w:rPr>
               <w:t>子区1</w:t>
             </w:r>
           </w:p>
@@ -2496,10 +2359,13 @@
           <w:p>
             <w:pPr>
               <w:pStyle w:val="AppleTableBody"/>
-              <w:spacing w:line="220" w:lineRule="exact"/>
+              <w:spacing w:line="170" w:lineRule="exact" w:before="0" w:after="0"/>
             </w:pPr>
             <w:r/>
             <w:r>
+              <w:rPr>
+                <w:sz w:val="15"/>
+              </w:rPr>
               <w:t>子区2</w:t>
             </w:r>
           </w:p>
@@ -2515,10 +2381,13 @@
           <w:p>
             <w:pPr>
               <w:pStyle w:val="AppleTableBody"/>
-              <w:spacing w:line="220" w:lineRule="exact"/>
+              <w:spacing w:line="170" w:lineRule="exact" w:before="0" w:after="0"/>
             </w:pPr>
             <w:r/>
             <w:r>
+              <w:rPr>
+                <w:sz w:val="15"/>
+              </w:rPr>
               <w:t>子区3</w:t>
             </w:r>
           </w:p>
@@ -2534,10 +2403,13 @@
           <w:p>
             <w:pPr>
               <w:pStyle w:val="AppleTableBody"/>
-              <w:spacing w:line="220" w:lineRule="exact"/>
+              <w:spacing w:line="170" w:lineRule="exact" w:before="0" w:after="0"/>
             </w:pPr>
             <w:r/>
             <w:r>
+              <w:rPr>
+                <w:sz w:val="15"/>
+              </w:rPr>
               <w:t>子区4</w:t>
             </w:r>
           </w:p>
@@ -2553,10 +2425,13 @@
           <w:p>
             <w:pPr>
               <w:pStyle w:val="AppleTableBody"/>
-              <w:spacing w:line="220" w:lineRule="exact"/>
+              <w:spacing w:line="170" w:lineRule="exact" w:before="0" w:after="0"/>
             </w:pPr>
             <w:r/>
             <w:r>
+              <w:rPr>
+                <w:sz w:val="15"/>
+              </w:rPr>
               <w:t>基础计数</w:t>
             </w:r>
           </w:p>
@@ -2572,10 +2447,13 @@
           <w:p>
             <w:pPr>
               <w:pStyle w:val="AppleTableBody"/>
-              <w:spacing w:line="220" w:lineRule="exact"/>
+              <w:spacing w:line="170" w:lineRule="exact" w:before="0" w:after="0"/>
             </w:pPr>
             <w:r/>
             <w:r>
+              <w:rPr>
+                <w:sz w:val="15"/>
+              </w:rPr>
               <w:t>遮挡线索数</w:t>
             </w:r>
           </w:p>
@@ -2592,10 +2470,13 @@
           <w:p>
             <w:pPr>
               <w:pStyle w:val="AppleTableBody"/>
-              <w:spacing w:line="220" w:lineRule="exact"/>
+              <w:spacing w:line="170" w:lineRule="exact" w:before="0" w:after="0"/>
             </w:pPr>
             <w:r/>
             <w:r>
+              <w:rPr>
+                <w:sz w:val="15"/>
+              </w:rPr>
               <w:t>R1</w:t>
             </w:r>
           </w:p>
@@ -2607,10 +2488,13 @@
           <w:p>
             <w:pPr>
               <w:pStyle w:val="AppleTableBody"/>
-              <w:spacing w:line="220" w:lineRule="exact"/>
+              <w:spacing w:line="170" w:lineRule="exact" w:before="0" w:after="0"/>
             </w:pPr>
             <w:r/>
             <w:r>
+              <w:rPr>
+                <w:sz w:val="15"/>
+              </w:rPr>
               <w:t>U-NE</w:t>
             </w:r>
           </w:p>
@@ -2622,10 +2506,13 @@
           <w:p>
             <w:pPr>
               <w:pStyle w:val="AppleTableBody"/>
-              <w:spacing w:line="220" w:lineRule="exact"/>
+              <w:spacing w:line="170" w:lineRule="exact" w:before="0" w:after="0"/>
             </w:pPr>
             <w:r/>
             <w:r>
+              <w:rPr>
+                <w:sz w:val="15"/>
+              </w:rPr>
               <w:t>上层</w:t>
             </w:r>
           </w:p>
@@ -2637,10 +2524,13 @@
           <w:p>
             <w:pPr>
               <w:pStyle w:val="AppleTableBody"/>
-              <w:spacing w:line="220" w:lineRule="exact"/>
+              <w:spacing w:line="170" w:lineRule="exact" w:before="0" w:after="0"/>
             </w:pPr>
             <w:r/>
             <w:r>
+              <w:rPr>
+                <w:sz w:val="15"/>
+              </w:rPr>
               <w:t>东北</w:t>
             </w:r>
           </w:p>
@@ -2652,10 +2542,13 @@
           <w:p>
             <w:pPr>
               <w:pStyle w:val="AppleTableBody"/>
-              <w:spacing w:line="220" w:lineRule="exact"/>
+              <w:spacing w:line="170" w:lineRule="exact" w:before="0" w:after="0"/>
             </w:pPr>
             <w:r/>
             <w:r>
+              <w:rPr>
+                <w:sz w:val="15"/>
+              </w:rPr>
               <w:t>15</w:t>
             </w:r>
           </w:p>
@@ -2667,10 +2560,13 @@
           <w:p>
             <w:pPr>
               <w:pStyle w:val="AppleTableBody"/>
-              <w:spacing w:line="220" w:lineRule="exact"/>
+              <w:spacing w:line="170" w:lineRule="exact" w:before="0" w:after="0"/>
             </w:pPr>
             <w:r/>
             <w:r>
+              <w:rPr>
+                <w:sz w:val="15"/>
+              </w:rPr>
               <w:t>16</w:t>
             </w:r>
           </w:p>
@@ -2682,10 +2578,13 @@
           <w:p>
             <w:pPr>
               <w:pStyle w:val="AppleTableBody"/>
-              <w:spacing w:line="220" w:lineRule="exact"/>
+              <w:spacing w:line="170" w:lineRule="exact" w:before="0" w:after="0"/>
             </w:pPr>
             <w:r/>
             <w:r>
+              <w:rPr>
+                <w:sz w:val="15"/>
+              </w:rPr>
               <w:t>14</w:t>
             </w:r>
           </w:p>
@@ -2697,10 +2596,13 @@
           <w:p>
             <w:pPr>
               <w:pStyle w:val="AppleTableBody"/>
-              <w:spacing w:line="220" w:lineRule="exact"/>
+              <w:spacing w:line="170" w:lineRule="exact" w:before="0" w:after="0"/>
             </w:pPr>
             <w:r/>
             <w:r>
+              <w:rPr>
+                <w:sz w:val="15"/>
+              </w:rPr>
               <w:t>15</w:t>
             </w:r>
           </w:p>
@@ -2712,10 +2614,13 @@
           <w:p>
             <w:pPr>
               <w:pStyle w:val="AppleTableBody"/>
-              <w:spacing w:line="220" w:lineRule="exact"/>
+              <w:spacing w:line="170" w:lineRule="exact" w:before="0" w:after="0"/>
             </w:pPr>
             <w:r/>
             <w:r>
+              <w:rPr>
+                <w:sz w:val="15"/>
+              </w:rPr>
               <w:t>60</w:t>
             </w:r>
           </w:p>
@@ -2727,10 +2632,13 @@
           <w:p>
             <w:pPr>
               <w:pStyle w:val="AppleTableBody"/>
-              <w:spacing w:line="220" w:lineRule="exact"/>
+              <w:spacing w:line="170" w:lineRule="exact" w:before="0" w:after="0"/>
             </w:pPr>
             <w:r/>
             <w:r>
+              <w:rPr>
+                <w:sz w:val="15"/>
+              </w:rPr>
               <w:t>15</w:t>
             </w:r>
           </w:p>
@@ -2747,10 +2655,13 @@
           <w:p>
             <w:pPr>
               <w:pStyle w:val="AppleTableBody"/>
-              <w:spacing w:line="220" w:lineRule="exact"/>
+              <w:spacing w:line="170" w:lineRule="exact" w:before="0" w:after="0"/>
             </w:pPr>
             <w:r/>
             <w:r>
+              <w:rPr>
+                <w:sz w:val="15"/>
+              </w:rPr>
               <w:t>R1</w:t>
             </w:r>
           </w:p>
@@ -2762,10 +2673,13 @@
           <w:p>
             <w:pPr>
               <w:pStyle w:val="AppleTableBody"/>
-              <w:spacing w:line="220" w:lineRule="exact"/>
+              <w:spacing w:line="170" w:lineRule="exact" w:before="0" w:after="0"/>
             </w:pPr>
             <w:r/>
             <w:r>
+              <w:rPr>
+                <w:sz w:val="15"/>
+              </w:rPr>
               <w:t>U-NW</w:t>
             </w:r>
           </w:p>
@@ -2777,10 +2691,13 @@
           <w:p>
             <w:pPr>
               <w:pStyle w:val="AppleTableBody"/>
-              <w:spacing w:line="220" w:lineRule="exact"/>
+              <w:spacing w:line="170" w:lineRule="exact" w:before="0" w:after="0"/>
             </w:pPr>
             <w:r/>
             <w:r>
+              <w:rPr>
+                <w:sz w:val="15"/>
+              </w:rPr>
               <w:t>上层</w:t>
             </w:r>
           </w:p>
@@ -2792,10 +2709,13 @@
           <w:p>
             <w:pPr>
               <w:pStyle w:val="AppleTableBody"/>
-              <w:spacing w:line="220" w:lineRule="exact"/>
+              <w:spacing w:line="170" w:lineRule="exact" w:before="0" w:after="0"/>
             </w:pPr>
             <w:r/>
             <w:r>
+              <w:rPr>
+                <w:sz w:val="15"/>
+              </w:rPr>
               <w:t>西北</w:t>
             </w:r>
           </w:p>
@@ -2807,10 +2727,13 @@
           <w:p>
             <w:pPr>
               <w:pStyle w:val="AppleTableBody"/>
-              <w:spacing w:line="220" w:lineRule="exact"/>
+              <w:spacing w:line="170" w:lineRule="exact" w:before="0" w:after="0"/>
             </w:pPr>
             <w:r/>
             <w:r>
+              <w:rPr>
+                <w:sz w:val="15"/>
+              </w:rPr>
               <w:t>16</w:t>
             </w:r>
           </w:p>
@@ -2822,10 +2745,13 @@
           <w:p>
             <w:pPr>
               <w:pStyle w:val="AppleTableBody"/>
-              <w:spacing w:line="220" w:lineRule="exact"/>
+              <w:spacing w:line="170" w:lineRule="exact" w:before="0" w:after="0"/>
             </w:pPr>
             <w:r/>
             <w:r>
+              <w:rPr>
+                <w:sz w:val="15"/>
+              </w:rPr>
               <w:t>17</w:t>
             </w:r>
           </w:p>
@@ -2837,10 +2763,13 @@
           <w:p>
             <w:pPr>
               <w:pStyle w:val="AppleTableBody"/>
-              <w:spacing w:line="220" w:lineRule="exact"/>
+              <w:spacing w:line="170" w:lineRule="exact" w:before="0" w:after="0"/>
             </w:pPr>
             <w:r/>
             <w:r>
+              <w:rPr>
+                <w:sz w:val="15"/>
+              </w:rPr>
               <w:t>15</w:t>
             </w:r>
           </w:p>
@@ -2852,10 +2781,13 @@
           <w:p>
             <w:pPr>
               <w:pStyle w:val="AppleTableBody"/>
-              <w:spacing w:line="220" w:lineRule="exact"/>
+              <w:spacing w:line="170" w:lineRule="exact" w:before="0" w:after="0"/>
             </w:pPr>
             <w:r/>
             <w:r>
+              <w:rPr>
+                <w:sz w:val="15"/>
+              </w:rPr>
               <w:t>16</w:t>
             </w:r>
           </w:p>
@@ -2867,10 +2799,13 @@
           <w:p>
             <w:pPr>
               <w:pStyle w:val="AppleTableBody"/>
-              <w:spacing w:line="220" w:lineRule="exact"/>
+              <w:spacing w:line="170" w:lineRule="exact" w:before="0" w:after="0"/>
             </w:pPr>
             <w:r/>
             <w:r>
+              <w:rPr>
+                <w:sz w:val="15"/>
+              </w:rPr>
               <w:t>64</w:t>
             </w:r>
           </w:p>
@@ -2882,10 +2817,13 @@
           <w:p>
             <w:pPr>
               <w:pStyle w:val="AppleTableBody"/>
-              <w:spacing w:line="220" w:lineRule="exact"/>
+              <w:spacing w:line="170" w:lineRule="exact" w:before="0" w:after="0"/>
             </w:pPr>
             <w:r/>
             <w:r>
+              <w:rPr>
+                <w:sz w:val="15"/>
+              </w:rPr>
               <w:t>16</w:t>
             </w:r>
           </w:p>
@@ -2902,10 +2840,13 @@
           <w:p>
             <w:pPr>
               <w:pStyle w:val="AppleTableBody"/>
-              <w:spacing w:line="220" w:lineRule="exact"/>
+              <w:spacing w:line="170" w:lineRule="exact" w:before="0" w:after="0"/>
             </w:pPr>
             <w:r/>
             <w:r>
+              <w:rPr>
+                <w:sz w:val="15"/>
+              </w:rPr>
               <w:t>R1</w:t>
             </w:r>
           </w:p>
@@ -2917,10 +2858,13 @@
           <w:p>
             <w:pPr>
               <w:pStyle w:val="AppleTableBody"/>
-              <w:spacing w:line="220" w:lineRule="exact"/>
+              <w:spacing w:line="170" w:lineRule="exact" w:before="0" w:after="0"/>
             </w:pPr>
             <w:r/>
             <w:r>
+              <w:rPr>
+                <w:sz w:val="15"/>
+              </w:rPr>
               <w:t>M-E</w:t>
             </w:r>
           </w:p>
@@ -2932,10 +2876,13 @@
           <w:p>
             <w:pPr>
               <w:pStyle w:val="AppleTableBody"/>
-              <w:spacing w:line="220" w:lineRule="exact"/>
+              <w:spacing w:line="170" w:lineRule="exact" w:before="0" w:after="0"/>
             </w:pPr>
             <w:r/>
             <w:r>
+              <w:rPr>
+                <w:sz w:val="15"/>
+              </w:rPr>
               <w:t>中层</w:t>
             </w:r>
           </w:p>
@@ -2947,10 +2894,13 @@
           <w:p>
             <w:pPr>
               <w:pStyle w:val="AppleTableBody"/>
-              <w:spacing w:line="220" w:lineRule="exact"/>
+              <w:spacing w:line="170" w:lineRule="exact" w:before="0" w:after="0"/>
             </w:pPr>
             <w:r/>
             <w:r>
+              <w:rPr>
+                <w:sz w:val="15"/>
+              </w:rPr>
               <w:t>东</w:t>
             </w:r>
           </w:p>
@@ -2962,10 +2912,13 @@
           <w:p>
             <w:pPr>
               <w:pStyle w:val="AppleTableBody"/>
-              <w:spacing w:line="220" w:lineRule="exact"/>
+              <w:spacing w:line="170" w:lineRule="exact" w:before="0" w:after="0"/>
             </w:pPr>
             <w:r/>
             <w:r>
+              <w:rPr>
+                <w:sz w:val="15"/>
+              </w:rPr>
               <w:t>26</w:t>
             </w:r>
           </w:p>
@@ -2977,10 +2930,13 @@
           <w:p>
             <w:pPr>
               <w:pStyle w:val="AppleTableBody"/>
-              <w:spacing w:line="220" w:lineRule="exact"/>
+              <w:spacing w:line="170" w:lineRule="exact" w:before="0" w:after="0"/>
             </w:pPr>
             <w:r/>
             <w:r>
+              <w:rPr>
+                <w:sz w:val="15"/>
+              </w:rPr>
               <w:t>27</w:t>
             </w:r>
           </w:p>
@@ -2992,10 +2948,13 @@
           <w:p>
             <w:pPr>
               <w:pStyle w:val="AppleTableBody"/>
-              <w:spacing w:line="220" w:lineRule="exact"/>
+              <w:spacing w:line="170" w:lineRule="exact" w:before="0" w:after="0"/>
             </w:pPr>
             <w:r/>
             <w:r>
+              <w:rPr>
+                <w:sz w:val="15"/>
+              </w:rPr>
               <w:t>25</w:t>
             </w:r>
           </w:p>
@@ -3007,10 +2966,13 @@
           <w:p>
             <w:pPr>
               <w:pStyle w:val="AppleTableBody"/>
-              <w:spacing w:line="220" w:lineRule="exact"/>
+              <w:spacing w:line="170" w:lineRule="exact" w:before="0" w:after="0"/>
             </w:pPr>
             <w:r/>
             <w:r>
+              <w:rPr>
+                <w:sz w:val="15"/>
+              </w:rPr>
               <w:t>26</w:t>
             </w:r>
           </w:p>
@@ -3022,10 +2984,13 @@
           <w:p>
             <w:pPr>
               <w:pStyle w:val="AppleTableBody"/>
-              <w:spacing w:line="220" w:lineRule="exact"/>
+              <w:spacing w:line="170" w:lineRule="exact" w:before="0" w:after="0"/>
             </w:pPr>
             <w:r/>
             <w:r>
+              <w:rPr>
+                <w:sz w:val="15"/>
+              </w:rPr>
               <w:t>104</w:t>
             </w:r>
           </w:p>
@@ -3037,10 +3002,13 @@
           <w:p>
             <w:pPr>
               <w:pStyle w:val="AppleTableBody"/>
-              <w:spacing w:line="220" w:lineRule="exact"/>
+              <w:spacing w:line="170" w:lineRule="exact" w:before="0" w:after="0"/>
             </w:pPr>
             <w:r/>
             <w:r>
+              <w:rPr>
+                <w:sz w:val="15"/>
+              </w:rPr>
               <w:t>16</w:t>
             </w:r>
           </w:p>
@@ -3057,10 +3025,13 @@
           <w:p>
             <w:pPr>
               <w:pStyle w:val="AppleTableBody"/>
-              <w:spacing w:line="220" w:lineRule="exact"/>
+              <w:spacing w:line="170" w:lineRule="exact" w:before="0" w:after="0"/>
             </w:pPr>
             <w:r/>
             <w:r>
+              <w:rPr>
+                <w:sz w:val="15"/>
+              </w:rPr>
               <w:t>R1</w:t>
             </w:r>
           </w:p>
@@ -3072,10 +3043,13 @@
           <w:p>
             <w:pPr>
               <w:pStyle w:val="AppleTableBody"/>
-              <w:spacing w:line="220" w:lineRule="exact"/>
+              <w:spacing w:line="170" w:lineRule="exact" w:before="0" w:after="0"/>
             </w:pPr>
             <w:r/>
             <w:r>
+              <w:rPr>
+                <w:sz w:val="15"/>
+              </w:rPr>
               <w:t>M-W</w:t>
             </w:r>
           </w:p>
@@ -3087,10 +3061,13 @@
           <w:p>
             <w:pPr>
               <w:pStyle w:val="AppleTableBody"/>
-              <w:spacing w:line="220" w:lineRule="exact"/>
+              <w:spacing w:line="170" w:lineRule="exact" w:before="0" w:after="0"/>
             </w:pPr>
             <w:r/>
             <w:r>
+              <w:rPr>
+                <w:sz w:val="15"/>
+              </w:rPr>
               <w:t>中层</w:t>
             </w:r>
           </w:p>
@@ -3102,10 +3079,13 @@
           <w:p>
             <w:pPr>
               <w:pStyle w:val="AppleTableBody"/>
-              <w:spacing w:line="220" w:lineRule="exact"/>
+              <w:spacing w:line="170" w:lineRule="exact" w:before="0" w:after="0"/>
             </w:pPr>
             <w:r/>
             <w:r>
+              <w:rPr>
+                <w:sz w:val="15"/>
+              </w:rPr>
               <w:t>西</w:t>
             </w:r>
           </w:p>
@@ -3117,10 +3097,13 @@
           <w:p>
             <w:pPr>
               <w:pStyle w:val="AppleTableBody"/>
-              <w:spacing w:line="220" w:lineRule="exact"/>
+              <w:spacing w:line="170" w:lineRule="exact" w:before="0" w:after="0"/>
             </w:pPr>
             <w:r/>
             <w:r>
+              <w:rPr>
+                <w:sz w:val="15"/>
+              </w:rPr>
               <w:t>28</w:t>
             </w:r>
           </w:p>
@@ -3132,10 +3115,13 @@
           <w:p>
             <w:pPr>
               <w:pStyle w:val="AppleTableBody"/>
-              <w:spacing w:line="220" w:lineRule="exact"/>
+              <w:spacing w:line="170" w:lineRule="exact" w:before="0" w:after="0"/>
             </w:pPr>
             <w:r/>
             <w:r>
+              <w:rPr>
+                <w:sz w:val="15"/>
+              </w:rPr>
               <w:t>27</w:t>
             </w:r>
           </w:p>
@@ -3147,10 +3133,13 @@
           <w:p>
             <w:pPr>
               <w:pStyle w:val="AppleTableBody"/>
-              <w:spacing w:line="220" w:lineRule="exact"/>
+              <w:spacing w:line="170" w:lineRule="exact" w:before="0" w:after="0"/>
             </w:pPr>
             <w:r/>
             <w:r>
+              <w:rPr>
+                <w:sz w:val="15"/>
+              </w:rPr>
               <w:t>28</w:t>
             </w:r>
           </w:p>
@@ -3162,10 +3151,13 @@
           <w:p>
             <w:pPr>
               <w:pStyle w:val="AppleTableBody"/>
-              <w:spacing w:line="220" w:lineRule="exact"/>
+              <w:spacing w:line="170" w:lineRule="exact" w:before="0" w:after="0"/>
             </w:pPr>
             <w:r/>
             <w:r>
+              <w:rPr>
+                <w:sz w:val="15"/>
+              </w:rPr>
               <w:t>27</w:t>
             </w:r>
           </w:p>
@@ -3177,10 +3169,13 @@
           <w:p>
             <w:pPr>
               <w:pStyle w:val="AppleTableBody"/>
-              <w:spacing w:line="220" w:lineRule="exact"/>
+              <w:spacing w:line="170" w:lineRule="exact" w:before="0" w:after="0"/>
             </w:pPr>
             <w:r/>
             <w:r>
+              <w:rPr>
+                <w:sz w:val="15"/>
+              </w:rPr>
               <w:t>110</w:t>
             </w:r>
           </w:p>
@@ -3192,10 +3187,13 @@
           <w:p>
             <w:pPr>
               <w:pStyle w:val="AppleTableBody"/>
-              <w:spacing w:line="220" w:lineRule="exact"/>
+              <w:spacing w:line="170" w:lineRule="exact" w:before="0" w:after="0"/>
             </w:pPr>
             <w:r/>
             <w:r>
+              <w:rPr>
+                <w:sz w:val="15"/>
+              </w:rPr>
               <w:t>17</w:t>
             </w:r>
           </w:p>
@@ -3212,10 +3210,13 @@
           <w:p>
             <w:pPr>
               <w:pStyle w:val="AppleTableBody"/>
-              <w:spacing w:line="220" w:lineRule="exact"/>
+              <w:spacing w:line="170" w:lineRule="exact" w:before="0" w:after="0"/>
             </w:pPr>
             <w:r/>
             <w:r>
+              <w:rPr>
+                <w:sz w:val="15"/>
+              </w:rPr>
               <w:t>R1</w:t>
             </w:r>
           </w:p>
@@ -3227,10 +3228,13 @@
           <w:p>
             <w:pPr>
               <w:pStyle w:val="AppleTableBody"/>
-              <w:spacing w:line="220" w:lineRule="exact"/>
+              <w:spacing w:line="170" w:lineRule="exact" w:before="0" w:after="0"/>
             </w:pPr>
             <w:r/>
             <w:r>
+              <w:rPr>
+                <w:sz w:val="15"/>
+              </w:rPr>
               <w:t>L-SE</w:t>
             </w:r>
           </w:p>
@@ -3242,10 +3246,13 @@
           <w:p>
             <w:pPr>
               <w:pStyle w:val="AppleTableBody"/>
-              <w:spacing w:line="220" w:lineRule="exact"/>
+              <w:spacing w:line="170" w:lineRule="exact" w:before="0" w:after="0"/>
             </w:pPr>
             <w:r/>
             <w:r>
+              <w:rPr>
+                <w:sz w:val="15"/>
+              </w:rPr>
               <w:t>下层</w:t>
             </w:r>
           </w:p>
@@ -3257,10 +3264,13 @@
           <w:p>
             <w:pPr>
               <w:pStyle w:val="AppleTableBody"/>
-              <w:spacing w:line="220" w:lineRule="exact"/>
+              <w:spacing w:line="170" w:lineRule="exact" w:before="0" w:after="0"/>
             </w:pPr>
             <w:r/>
             <w:r>
+              <w:rPr>
+                <w:sz w:val="15"/>
+              </w:rPr>
               <w:t>东南</w:t>
             </w:r>
           </w:p>
@@ -3272,10 +3282,13 @@
           <w:p>
             <w:pPr>
               <w:pStyle w:val="AppleTableBody"/>
-              <w:spacing w:line="220" w:lineRule="exact"/>
+              <w:spacing w:line="170" w:lineRule="exact" w:before="0" w:after="0"/>
             </w:pPr>
             <w:r/>
             <w:r>
+              <w:rPr>
+                <w:sz w:val="15"/>
+              </w:rPr>
               <w:t>22</w:t>
             </w:r>
           </w:p>
@@ -3287,10 +3300,13 @@
           <w:p>
             <w:pPr>
               <w:pStyle w:val="AppleTableBody"/>
-              <w:spacing w:line="220" w:lineRule="exact"/>
+              <w:spacing w:line="170" w:lineRule="exact" w:before="0" w:after="0"/>
             </w:pPr>
             <w:r/>
             <w:r>
+              <w:rPr>
+                <w:sz w:val="15"/>
+              </w:rPr>
               <w:t>22</w:t>
             </w:r>
           </w:p>
@@ -3302,10 +3318,13 @@
           <w:p>
             <w:pPr>
               <w:pStyle w:val="AppleTableBody"/>
-              <w:spacing w:line="220" w:lineRule="exact"/>
+              <w:spacing w:line="170" w:lineRule="exact" w:before="0" w:after="0"/>
             </w:pPr>
             <w:r/>
             <w:r>
+              <w:rPr>
+                <w:sz w:val="15"/>
+              </w:rPr>
               <w:t>21</w:t>
             </w:r>
           </w:p>
@@ -3317,10 +3336,13 @@
           <w:p>
             <w:pPr>
               <w:pStyle w:val="AppleTableBody"/>
-              <w:spacing w:line="220" w:lineRule="exact"/>
+              <w:spacing w:line="170" w:lineRule="exact" w:before="0" w:after="0"/>
             </w:pPr>
             <w:r/>
             <w:r>
+              <w:rPr>
+                <w:sz w:val="15"/>
+              </w:rPr>
               <w:t>22</w:t>
             </w:r>
           </w:p>
@@ -3332,10 +3354,13 @@
           <w:p>
             <w:pPr>
               <w:pStyle w:val="AppleTableBody"/>
-              <w:spacing w:line="220" w:lineRule="exact"/>
+              <w:spacing w:line="170" w:lineRule="exact" w:before="0" w:after="0"/>
             </w:pPr>
             <w:r/>
             <w:r>
+              <w:rPr>
+                <w:sz w:val="15"/>
+              </w:rPr>
               <w:t>87</w:t>
             </w:r>
           </w:p>
@@ -3347,10 +3372,13 @@
           <w:p>
             <w:pPr>
               <w:pStyle w:val="AppleTableBody"/>
-              <w:spacing w:line="220" w:lineRule="exact"/>
+              <w:spacing w:line="170" w:lineRule="exact" w:before="0" w:after="0"/>
             </w:pPr>
             <w:r/>
             <w:r>
+              <w:rPr>
+                <w:sz w:val="15"/>
+              </w:rPr>
               <w:t>36</w:t>
             </w:r>
           </w:p>
@@ -3367,10 +3395,13 @@
           <w:p>
             <w:pPr>
               <w:pStyle w:val="AppleTableBody"/>
-              <w:spacing w:line="220" w:lineRule="exact"/>
+              <w:spacing w:line="170" w:lineRule="exact" w:before="0" w:after="0"/>
             </w:pPr>
             <w:r/>
             <w:r>
+              <w:rPr>
+                <w:sz w:val="15"/>
+              </w:rPr>
               <w:t>R1</w:t>
             </w:r>
           </w:p>
@@ -3382,10 +3413,13 @@
           <w:p>
             <w:pPr>
               <w:pStyle w:val="AppleTableBody"/>
-              <w:spacing w:line="220" w:lineRule="exact"/>
+              <w:spacing w:line="170" w:lineRule="exact" w:before="0" w:after="0"/>
             </w:pPr>
             <w:r/>
             <w:r>
+              <w:rPr>
+                <w:sz w:val="15"/>
+              </w:rPr>
               <w:t>L-SW</w:t>
             </w:r>
           </w:p>
@@ -3397,10 +3431,13 @@
           <w:p>
             <w:pPr>
               <w:pStyle w:val="AppleTableBody"/>
-              <w:spacing w:line="220" w:lineRule="exact"/>
+              <w:spacing w:line="170" w:lineRule="exact" w:before="0" w:after="0"/>
             </w:pPr>
             <w:r/>
             <w:r>
+              <w:rPr>
+                <w:sz w:val="15"/>
+              </w:rPr>
               <w:t>下层</w:t>
             </w:r>
           </w:p>
@@ -3412,10 +3449,13 @@
           <w:p>
             <w:pPr>
               <w:pStyle w:val="AppleTableBody"/>
-              <w:spacing w:line="220" w:lineRule="exact"/>
+              <w:spacing w:line="170" w:lineRule="exact" w:before="0" w:after="0"/>
             </w:pPr>
             <w:r/>
             <w:r>
+              <w:rPr>
+                <w:sz w:val="15"/>
+              </w:rPr>
               <w:t>西南</w:t>
             </w:r>
           </w:p>
@@ -3427,10 +3467,13 @@
           <w:p>
             <w:pPr>
               <w:pStyle w:val="AppleTableBody"/>
-              <w:spacing w:line="220" w:lineRule="exact"/>
+              <w:spacing w:line="170" w:lineRule="exact" w:before="0" w:after="0"/>
             </w:pPr>
             <w:r/>
             <w:r>
+              <w:rPr>
+                <w:sz w:val="15"/>
+              </w:rPr>
               <w:t>23</w:t>
             </w:r>
           </w:p>
@@ -3442,10 +3485,13 @@
           <w:p>
             <w:pPr>
               <w:pStyle w:val="AppleTableBody"/>
-              <w:spacing w:line="220" w:lineRule="exact"/>
+              <w:spacing w:line="170" w:lineRule="exact" w:before="0" w:after="0"/>
             </w:pPr>
             <w:r/>
             <w:r>
+              <w:rPr>
+                <w:sz w:val="15"/>
+              </w:rPr>
               <w:t>23</w:t>
             </w:r>
           </w:p>
@@ -3457,10 +3503,13 @@
           <w:p>
             <w:pPr>
               <w:pStyle w:val="AppleTableBody"/>
-              <w:spacing w:line="220" w:lineRule="exact"/>
+              <w:spacing w:line="170" w:lineRule="exact" w:before="0" w:after="0"/>
             </w:pPr>
             <w:r/>
             <w:r>
+              <w:rPr>
+                <w:sz w:val="15"/>
+              </w:rPr>
               <w:t>22</w:t>
             </w:r>
           </w:p>
@@ -3472,10 +3521,13 @@
           <w:p>
             <w:pPr>
               <w:pStyle w:val="AppleTableBody"/>
-              <w:spacing w:line="220" w:lineRule="exact"/>
+              <w:spacing w:line="170" w:lineRule="exact" w:before="0" w:after="0"/>
             </w:pPr>
             <w:r/>
             <w:r>
+              <w:rPr>
+                <w:sz w:val="15"/>
+              </w:rPr>
               <w:t>23</w:t>
             </w:r>
           </w:p>
@@ -3487,10 +3539,13 @@
           <w:p>
             <w:pPr>
               <w:pStyle w:val="AppleTableBody"/>
-              <w:spacing w:line="220" w:lineRule="exact"/>
+              <w:spacing w:line="170" w:lineRule="exact" w:before="0" w:after="0"/>
             </w:pPr>
             <w:r/>
             <w:r>
+              <w:rPr>
+                <w:sz w:val="15"/>
+              </w:rPr>
               <w:t>91</w:t>
             </w:r>
           </w:p>
@@ -3502,10 +3557,13 @@
           <w:p>
             <w:pPr>
               <w:pStyle w:val="AppleTableBody"/>
-              <w:spacing w:line="220" w:lineRule="exact"/>
+              <w:spacing w:line="170" w:lineRule="exact" w:before="0" w:after="0"/>
             </w:pPr>
             <w:r/>
             <w:r>
+              <w:rPr>
+                <w:sz w:val="15"/>
+              </w:rPr>
               <w:t>38</w:t>
             </w:r>
           </w:p>
@@ -3522,10 +3580,13 @@
           <w:p>
             <w:pPr>
               <w:pStyle w:val="AppleTableBody"/>
-              <w:spacing w:line="220" w:lineRule="exact"/>
+              <w:spacing w:line="170" w:lineRule="exact" w:before="0" w:after="0"/>
             </w:pPr>
             <w:r/>
             <w:r>
+              <w:rPr>
+                <w:sz w:val="15"/>
+              </w:rPr>
               <w:t>R2</w:t>
             </w:r>
           </w:p>
@@ -3537,10 +3598,13 @@
           <w:p>
             <w:pPr>
               <w:pStyle w:val="AppleTableBody"/>
-              <w:spacing w:line="220" w:lineRule="exact"/>
+              <w:spacing w:line="170" w:lineRule="exact" w:before="0" w:after="0"/>
             </w:pPr>
             <w:r/>
             <w:r>
+              <w:rPr>
+                <w:sz w:val="15"/>
+              </w:rPr>
               <w:t>U-NE</w:t>
             </w:r>
           </w:p>
@@ -3552,10 +3616,13 @@
           <w:p>
             <w:pPr>
               <w:pStyle w:val="AppleTableBody"/>
-              <w:spacing w:line="220" w:lineRule="exact"/>
+              <w:spacing w:line="170" w:lineRule="exact" w:before="0" w:after="0"/>
             </w:pPr>
             <w:r/>
             <w:r>
+              <w:rPr>
+                <w:sz w:val="15"/>
+              </w:rPr>
               <w:t>上层</w:t>
             </w:r>
           </w:p>
@@ -3567,10 +3634,13 @@
           <w:p>
             <w:pPr>
               <w:pStyle w:val="AppleTableBody"/>
-              <w:spacing w:line="220" w:lineRule="exact"/>
+              <w:spacing w:line="170" w:lineRule="exact" w:before="0" w:after="0"/>
             </w:pPr>
             <w:r/>
             <w:r>
+              <w:rPr>
+                <w:sz w:val="15"/>
+              </w:rPr>
               <w:t>东北</w:t>
             </w:r>
           </w:p>
@@ -3582,10 +3652,13 @@
           <w:p>
             <w:pPr>
               <w:pStyle w:val="AppleTableBody"/>
-              <w:spacing w:line="220" w:lineRule="exact"/>
+              <w:spacing w:line="170" w:lineRule="exact" w:before="0" w:after="0"/>
             </w:pPr>
             <w:r/>
             <w:r>
+              <w:rPr>
+                <w:sz w:val="15"/>
+              </w:rPr>
               <w:t>15</w:t>
             </w:r>
           </w:p>
@@ -3597,10 +3670,13 @@
           <w:p>
             <w:pPr>
               <w:pStyle w:val="AppleTableBody"/>
-              <w:spacing w:line="220" w:lineRule="exact"/>
+              <w:spacing w:line="170" w:lineRule="exact" w:before="0" w:after="0"/>
             </w:pPr>
             <w:r/>
             <w:r>
+              <w:rPr>
+                <w:sz w:val="15"/>
+              </w:rPr>
               <w:t>15</w:t>
             </w:r>
           </w:p>
@@ -3612,10 +3688,13 @@
           <w:p>
             <w:pPr>
               <w:pStyle w:val="AppleTableBody"/>
-              <w:spacing w:line="220" w:lineRule="exact"/>
+              <w:spacing w:line="170" w:lineRule="exact" w:before="0" w:after="0"/>
             </w:pPr>
             <w:r/>
             <w:r>
+              <w:rPr>
+                <w:sz w:val="15"/>
+              </w:rPr>
               <w:t>14</w:t>
             </w:r>
           </w:p>
@@ -3627,10 +3706,13 @@
           <w:p>
             <w:pPr>
               <w:pStyle w:val="AppleTableBody"/>
-              <w:spacing w:line="220" w:lineRule="exact"/>
+              <w:spacing w:line="170" w:lineRule="exact" w:before="0" w:after="0"/>
             </w:pPr>
             <w:r/>
             <w:r>
+              <w:rPr>
+                <w:sz w:val="15"/>
+              </w:rPr>
               <w:t>16</w:t>
             </w:r>
           </w:p>
@@ -3642,10 +3724,13 @@
           <w:p>
             <w:pPr>
               <w:pStyle w:val="AppleTableBody"/>
-              <w:spacing w:line="220" w:lineRule="exact"/>
+              <w:spacing w:line="170" w:lineRule="exact" w:before="0" w:after="0"/>
             </w:pPr>
             <w:r/>
             <w:r>
+              <w:rPr>
+                <w:sz w:val="15"/>
+              </w:rPr>
               <w:t>60</w:t>
             </w:r>
           </w:p>
@@ -3657,10 +3742,13 @@
           <w:p>
             <w:pPr>
               <w:pStyle w:val="AppleTableBody"/>
-              <w:spacing w:line="220" w:lineRule="exact"/>
+              <w:spacing w:line="170" w:lineRule="exact" w:before="0" w:after="0"/>
             </w:pPr>
             <w:r/>
             <w:r>
+              <w:rPr>
+                <w:sz w:val="15"/>
+              </w:rPr>
               <w:t>15</w:t>
             </w:r>
           </w:p>
@@ -3677,10 +3765,13 @@
           <w:p>
             <w:pPr>
               <w:pStyle w:val="AppleTableBody"/>
-              <w:spacing w:line="220" w:lineRule="exact"/>
+              <w:spacing w:line="170" w:lineRule="exact" w:before="0" w:after="0"/>
             </w:pPr>
             <w:r/>
             <w:r>
+              <w:rPr>
+                <w:sz w:val="15"/>
+              </w:rPr>
               <w:t>R2</w:t>
             </w:r>
           </w:p>
@@ -3692,10 +3783,13 @@
           <w:p>
             <w:pPr>
               <w:pStyle w:val="AppleTableBody"/>
-              <w:spacing w:line="220" w:lineRule="exact"/>
+              <w:spacing w:line="170" w:lineRule="exact" w:before="0" w:after="0"/>
             </w:pPr>
             <w:r/>
             <w:r>
+              <w:rPr>
+                <w:sz w:val="15"/>
+              </w:rPr>
               <w:t>U-NW</w:t>
             </w:r>
           </w:p>
@@ -3707,10 +3801,13 @@
           <w:p>
             <w:pPr>
               <w:pStyle w:val="AppleTableBody"/>
-              <w:spacing w:line="220" w:lineRule="exact"/>
+              <w:spacing w:line="170" w:lineRule="exact" w:before="0" w:after="0"/>
             </w:pPr>
             <w:r/>
             <w:r>
+              <w:rPr>
+                <w:sz w:val="15"/>
+              </w:rPr>
               <w:t>上层</w:t>
             </w:r>
           </w:p>
@@ -3722,10 +3819,13 @@
           <w:p>
             <w:pPr>
               <w:pStyle w:val="AppleTableBody"/>
-              <w:spacing w:line="220" w:lineRule="exact"/>
+              <w:spacing w:line="170" w:lineRule="exact" w:before="0" w:after="0"/>
             </w:pPr>
             <w:r/>
             <w:r>
+              <w:rPr>
+                <w:sz w:val="15"/>
+              </w:rPr>
               <w:t>西北</w:t>
             </w:r>
           </w:p>
@@ -3737,10 +3837,13 @@
           <w:p>
             <w:pPr>
               <w:pStyle w:val="AppleTableBody"/>
-              <w:spacing w:line="220" w:lineRule="exact"/>
+              <w:spacing w:line="170" w:lineRule="exact" w:before="0" w:after="0"/>
             </w:pPr>
             <w:r/>
             <w:r>
+              <w:rPr>
+                <w:sz w:val="15"/>
+              </w:rPr>
               <w:t>16</w:t>
             </w:r>
           </w:p>
@@ -3752,10 +3855,13 @@
           <w:p>
             <w:pPr>
               <w:pStyle w:val="AppleTableBody"/>
-              <w:spacing w:line="220" w:lineRule="exact"/>
+              <w:spacing w:line="170" w:lineRule="exact" w:before="0" w:after="0"/>
             </w:pPr>
             <w:r/>
             <w:r>
+              <w:rPr>
+                <w:sz w:val="15"/>
+              </w:rPr>
               <w:t>15</w:t>
             </w:r>
           </w:p>
@@ -3767,10 +3873,13 @@
           <w:p>
             <w:pPr>
               <w:pStyle w:val="AppleTableBody"/>
-              <w:spacing w:line="220" w:lineRule="exact"/>
+              <w:spacing w:line="170" w:lineRule="exact" w:before="0" w:after="0"/>
             </w:pPr>
             <w:r/>
             <w:r>
+              <w:rPr>
+                <w:sz w:val="15"/>
+              </w:rPr>
               <w:t>16</w:t>
             </w:r>
           </w:p>
@@ -3782,10 +3891,13 @@
           <w:p>
             <w:pPr>
               <w:pStyle w:val="AppleTableBody"/>
-              <w:spacing w:line="220" w:lineRule="exact"/>
+              <w:spacing w:line="170" w:lineRule="exact" w:before="0" w:after="0"/>
             </w:pPr>
             <w:r/>
             <w:r>
+              <w:rPr>
+                <w:sz w:val="15"/>
+              </w:rPr>
               <w:t>15</w:t>
             </w:r>
           </w:p>
@@ -3797,10 +3909,13 @@
           <w:p>
             <w:pPr>
               <w:pStyle w:val="AppleTableBody"/>
-              <w:spacing w:line="220" w:lineRule="exact"/>
+              <w:spacing w:line="170" w:lineRule="exact" w:before="0" w:after="0"/>
             </w:pPr>
             <w:r/>
             <w:r>
+              <w:rPr>
+                <w:sz w:val="15"/>
+              </w:rPr>
               <w:t>62</w:t>
             </w:r>
           </w:p>
@@ -3812,10 +3927,13 @@
           <w:p>
             <w:pPr>
               <w:pStyle w:val="AppleTableBody"/>
-              <w:spacing w:line="220" w:lineRule="exact"/>
+              <w:spacing w:line="170" w:lineRule="exact" w:before="0" w:after="0"/>
             </w:pPr>
             <w:r/>
             <w:r>
+              <w:rPr>
+                <w:sz w:val="15"/>
+              </w:rPr>
               <w:t>17</w:t>
             </w:r>
           </w:p>
@@ -3832,10 +3950,13 @@
           <w:p>
             <w:pPr>
               <w:pStyle w:val="AppleTableBody"/>
-              <w:spacing w:line="220" w:lineRule="exact"/>
+              <w:spacing w:line="170" w:lineRule="exact" w:before="0" w:after="0"/>
             </w:pPr>
             <w:r/>
             <w:r>
+              <w:rPr>
+                <w:sz w:val="15"/>
+              </w:rPr>
               <w:t>R2</w:t>
             </w:r>
           </w:p>
@@ -3847,10 +3968,13 @@
           <w:p>
             <w:pPr>
               <w:pStyle w:val="AppleTableBody"/>
-              <w:spacing w:line="220" w:lineRule="exact"/>
+              <w:spacing w:line="170" w:lineRule="exact" w:before="0" w:after="0"/>
             </w:pPr>
             <w:r/>
             <w:r>
+              <w:rPr>
+                <w:sz w:val="15"/>
+              </w:rPr>
               <w:t>M-E</w:t>
             </w:r>
           </w:p>
@@ -3862,10 +3986,13 @@
           <w:p>
             <w:pPr>
               <w:pStyle w:val="AppleTableBody"/>
-              <w:spacing w:line="220" w:lineRule="exact"/>
+              <w:spacing w:line="170" w:lineRule="exact" w:before="0" w:after="0"/>
             </w:pPr>
             <w:r/>
             <w:r>
+              <w:rPr>
+                <w:sz w:val="15"/>
+              </w:rPr>
               <w:t>中层</w:t>
             </w:r>
           </w:p>
@@ -3877,10 +4004,13 @@
           <w:p>
             <w:pPr>
               <w:pStyle w:val="AppleTableBody"/>
-              <w:spacing w:line="220" w:lineRule="exact"/>
+              <w:spacing w:line="170" w:lineRule="exact" w:before="0" w:after="0"/>
             </w:pPr>
             <w:r/>
             <w:r>
+              <w:rPr>
+                <w:sz w:val="15"/>
+              </w:rPr>
               <w:t>东</w:t>
             </w:r>
           </w:p>
@@ -3892,10 +4022,13 @@
           <w:p>
             <w:pPr>
               <w:pStyle w:val="AppleTableBody"/>
-              <w:spacing w:line="220" w:lineRule="exact"/>
+              <w:spacing w:line="170" w:lineRule="exact" w:before="0" w:after="0"/>
             </w:pPr>
             <w:r/>
             <w:r>
+              <w:rPr>
+                <w:sz w:val="15"/>
+              </w:rPr>
               <w:t>23</w:t>
             </w:r>
           </w:p>
@@ -3907,10 +4040,13 @@
           <w:p>
             <w:pPr>
               <w:pStyle w:val="AppleTableBody"/>
-              <w:spacing w:line="220" w:lineRule="exact"/>
+              <w:spacing w:line="170" w:lineRule="exact" w:before="0" w:after="0"/>
             </w:pPr>
             <w:r/>
             <w:r>
+              <w:rPr>
+                <w:sz w:val="15"/>
+              </w:rPr>
               <w:t>25</w:t>
             </w:r>
           </w:p>
@@ -3922,10 +4058,13 @@
           <w:p>
             <w:pPr>
               <w:pStyle w:val="AppleTableBody"/>
-              <w:spacing w:line="220" w:lineRule="exact"/>
+              <w:spacing w:line="170" w:lineRule="exact" w:before="0" w:after="0"/>
             </w:pPr>
             <w:r/>
             <w:r>
+              <w:rPr>
+                <w:sz w:val="15"/>
+              </w:rPr>
               <w:t>24</w:t>
             </w:r>
           </w:p>
@@ -3937,10 +4076,13 @@
           <w:p>
             <w:pPr>
               <w:pStyle w:val="AppleTableBody"/>
-              <w:spacing w:line="220" w:lineRule="exact"/>
+              <w:spacing w:line="170" w:lineRule="exact" w:before="0" w:after="0"/>
             </w:pPr>
             <w:r/>
             <w:r>
+              <w:rPr>
+                <w:sz w:val="15"/>
+              </w:rPr>
               <w:t>22</w:t>
             </w:r>
           </w:p>
@@ -3952,10 +4094,13 @@
           <w:p>
             <w:pPr>
               <w:pStyle w:val="AppleTableBody"/>
-              <w:spacing w:line="220" w:lineRule="exact"/>
+              <w:spacing w:line="170" w:lineRule="exact" w:before="0" w:after="0"/>
             </w:pPr>
             <w:r/>
             <w:r>
+              <w:rPr>
+                <w:sz w:val="15"/>
+              </w:rPr>
               <w:t>94</w:t>
             </w:r>
           </w:p>
@@ -3967,10 +4112,13 @@
           <w:p>
             <w:pPr>
               <w:pStyle w:val="AppleTableBody"/>
-              <w:spacing w:line="220" w:lineRule="exact"/>
+              <w:spacing w:line="170" w:lineRule="exact" w:before="0" w:after="0"/>
             </w:pPr>
             <w:r/>
             <w:r>
+              <w:rPr>
+                <w:sz w:val="15"/>
+              </w:rPr>
               <w:t>18</w:t>
             </w:r>
           </w:p>
@@ -3987,10 +4135,13 @@
           <w:p>
             <w:pPr>
               <w:pStyle w:val="AppleTableBody"/>
-              <w:spacing w:line="220" w:lineRule="exact"/>
+              <w:spacing w:line="170" w:lineRule="exact" w:before="0" w:after="0"/>
             </w:pPr>
             <w:r/>
             <w:r>
+              <w:rPr>
+                <w:sz w:val="15"/>
+              </w:rPr>
               <w:t>R2</w:t>
             </w:r>
           </w:p>
@@ -4002,10 +4153,13 @@
           <w:p>
             <w:pPr>
               <w:pStyle w:val="AppleTableBody"/>
-              <w:spacing w:line="220" w:lineRule="exact"/>
+              <w:spacing w:line="170" w:lineRule="exact" w:before="0" w:after="0"/>
             </w:pPr>
             <w:r/>
             <w:r>
+              <w:rPr>
+                <w:sz w:val="15"/>
+              </w:rPr>
               <w:t>M-W</w:t>
             </w:r>
           </w:p>
@@ -4017,10 +4171,13 @@
           <w:p>
             <w:pPr>
               <w:pStyle w:val="AppleTableBody"/>
-              <w:spacing w:line="220" w:lineRule="exact"/>
+              <w:spacing w:line="170" w:lineRule="exact" w:before="0" w:after="0"/>
             </w:pPr>
             <w:r/>
             <w:r>
+              <w:rPr>
+                <w:sz w:val="15"/>
+              </w:rPr>
               <w:t>中层</w:t>
             </w:r>
           </w:p>
@@ -4032,10 +4189,13 @@
           <w:p>
             <w:pPr>
               <w:pStyle w:val="AppleTableBody"/>
-              <w:spacing w:line="220" w:lineRule="exact"/>
+              <w:spacing w:line="170" w:lineRule="exact" w:before="0" w:after="0"/>
             </w:pPr>
             <w:r/>
             <w:r>
+              <w:rPr>
+                <w:sz w:val="15"/>
+              </w:rPr>
               <w:t>西</w:t>
             </w:r>
           </w:p>
@@ -4047,10 +4207,13 @@
           <w:p>
             <w:pPr>
               <w:pStyle w:val="AppleTableBody"/>
-              <w:spacing w:line="220" w:lineRule="exact"/>
+              <w:spacing w:line="170" w:lineRule="exact" w:before="0" w:after="0"/>
             </w:pPr>
             <w:r/>
             <w:r>
+              <w:rPr>
+                <w:sz w:val="15"/>
+              </w:rPr>
               <w:t>27</w:t>
             </w:r>
           </w:p>
@@ -4062,10 +4225,13 @@
           <w:p>
             <w:pPr>
               <w:pStyle w:val="AppleTableBody"/>
-              <w:spacing w:line="220" w:lineRule="exact"/>
+              <w:spacing w:line="170" w:lineRule="exact" w:before="0" w:after="0"/>
             </w:pPr>
             <w:r/>
             <w:r>
+              <w:rPr>
+                <w:sz w:val="15"/>
+              </w:rPr>
               <w:t>28</w:t>
             </w:r>
           </w:p>
@@ -4077,10 +4243,13 @@
           <w:p>
             <w:pPr>
               <w:pStyle w:val="AppleTableBody"/>
-              <w:spacing w:line="220" w:lineRule="exact"/>
+              <w:spacing w:line="170" w:lineRule="exact" w:before="0" w:after="0"/>
             </w:pPr>
             <w:r/>
             <w:r>
+              <w:rPr>
+                <w:sz w:val="15"/>
+              </w:rPr>
               <w:t>27</w:t>
             </w:r>
           </w:p>
@@ -4092,10 +4261,13 @@
           <w:p>
             <w:pPr>
               <w:pStyle w:val="AppleTableBody"/>
-              <w:spacing w:line="220" w:lineRule="exact"/>
+              <w:spacing w:line="170" w:lineRule="exact" w:before="0" w:after="0"/>
             </w:pPr>
             <w:r/>
             <w:r>
+              <w:rPr>
+                <w:sz w:val="15"/>
+              </w:rPr>
               <w:t>27</w:t>
             </w:r>
           </w:p>
@@ -4107,10 +4279,13 @@
           <w:p>
             <w:pPr>
               <w:pStyle w:val="AppleTableBody"/>
-              <w:spacing w:line="220" w:lineRule="exact"/>
+              <w:spacing w:line="170" w:lineRule="exact" w:before="0" w:after="0"/>
             </w:pPr>
             <w:r/>
             <w:r>
+              <w:rPr>
+                <w:sz w:val="15"/>
+              </w:rPr>
               <w:t>109</w:t>
             </w:r>
           </w:p>
@@ -4122,10 +4297,13 @@
           <w:p>
             <w:pPr>
               <w:pStyle w:val="AppleTableBody"/>
-              <w:spacing w:line="220" w:lineRule="exact"/>
+              <w:spacing w:line="170" w:lineRule="exact" w:before="0" w:after="0"/>
             </w:pPr>
             <w:r/>
             <w:r>
+              <w:rPr>
+                <w:sz w:val="15"/>
+              </w:rPr>
               <w:t>18</w:t>
             </w:r>
           </w:p>
@@ -4142,10 +4320,13 @@
           <w:p>
             <w:pPr>
               <w:pStyle w:val="AppleTableBody"/>
-              <w:spacing w:line="220" w:lineRule="exact"/>
+              <w:spacing w:line="170" w:lineRule="exact" w:before="0" w:after="0"/>
             </w:pPr>
             <w:r/>
             <w:r>
+              <w:rPr>
+                <w:sz w:val="15"/>
+              </w:rPr>
               <w:t>R2</w:t>
             </w:r>
           </w:p>
@@ -4157,10 +4338,13 @@
           <w:p>
             <w:pPr>
               <w:pStyle w:val="AppleTableBody"/>
-              <w:spacing w:line="220" w:lineRule="exact"/>
+              <w:spacing w:line="170" w:lineRule="exact" w:before="0" w:after="0"/>
             </w:pPr>
             <w:r/>
             <w:r>
+              <w:rPr>
+                <w:sz w:val="15"/>
+              </w:rPr>
               <w:t>L-SE</w:t>
             </w:r>
           </w:p>
@@ -4172,10 +4356,13 @@
           <w:p>
             <w:pPr>
               <w:pStyle w:val="AppleTableBody"/>
-              <w:spacing w:line="220" w:lineRule="exact"/>
+              <w:spacing w:line="170" w:lineRule="exact" w:before="0" w:after="0"/>
             </w:pPr>
             <w:r/>
             <w:r>
+              <w:rPr>
+                <w:sz w:val="15"/>
+              </w:rPr>
               <w:t>下层</w:t>
             </w:r>
           </w:p>
@@ -4187,10 +4374,13 @@
           <w:p>
             <w:pPr>
               <w:pStyle w:val="AppleTableBody"/>
-              <w:spacing w:line="220" w:lineRule="exact"/>
+              <w:spacing w:line="170" w:lineRule="exact" w:before="0" w:after="0"/>
             </w:pPr>
             <w:r/>
             <w:r>
+              <w:rPr>
+                <w:sz w:val="15"/>
+              </w:rPr>
               <w:t>东南</w:t>
             </w:r>
           </w:p>
@@ -4202,10 +4392,13 @@
           <w:p>
             <w:pPr>
               <w:pStyle w:val="AppleTableBody"/>
-              <w:spacing w:line="220" w:lineRule="exact"/>
+              <w:spacing w:line="170" w:lineRule="exact" w:before="0" w:after="0"/>
             </w:pPr>
             <w:r/>
             <w:r>
+              <w:rPr>
+                <w:sz w:val="15"/>
+              </w:rPr>
               <w:t>28</w:t>
             </w:r>
           </w:p>
@@ -4217,10 +4410,13 @@
           <w:p>
             <w:pPr>
               <w:pStyle w:val="AppleTableBody"/>
-              <w:spacing w:line="220" w:lineRule="exact"/>
+              <w:spacing w:line="170" w:lineRule="exact" w:before="0" w:after="0"/>
             </w:pPr>
             <w:r/>
             <w:r>
+              <w:rPr>
+                <w:sz w:val="15"/>
+              </w:rPr>
               <w:t>27</w:t>
             </w:r>
           </w:p>
@@ -4232,10 +4428,13 @@
           <w:p>
             <w:pPr>
               <w:pStyle w:val="AppleTableBody"/>
-              <w:spacing w:line="220" w:lineRule="exact"/>
+              <w:spacing w:line="170" w:lineRule="exact" w:before="0" w:after="0"/>
             </w:pPr>
             <w:r/>
             <w:r>
+              <w:rPr>
+                <w:sz w:val="15"/>
+              </w:rPr>
               <w:t>28</w:t>
             </w:r>
           </w:p>
@@ -4247,10 +4446,13 @@
           <w:p>
             <w:pPr>
               <w:pStyle w:val="AppleTableBody"/>
-              <w:spacing w:line="220" w:lineRule="exact"/>
+              <w:spacing w:line="170" w:lineRule="exact" w:before="0" w:after="0"/>
             </w:pPr>
             <w:r/>
             <w:r>
+              <w:rPr>
+                <w:sz w:val="15"/>
+              </w:rPr>
               <w:t>27</w:t>
             </w:r>
           </w:p>
@@ -4262,10 +4464,13 @@
           <w:p>
             <w:pPr>
               <w:pStyle w:val="AppleTableBody"/>
-              <w:spacing w:line="220" w:lineRule="exact"/>
+              <w:spacing w:line="170" w:lineRule="exact" w:before="0" w:after="0"/>
             </w:pPr>
             <w:r/>
             <w:r>
+              <w:rPr>
+                <w:sz w:val="15"/>
+              </w:rPr>
               <w:t>110</w:t>
             </w:r>
           </w:p>
@@ -4277,10 +4482,13 @@
           <w:p>
             <w:pPr>
               <w:pStyle w:val="AppleTableBody"/>
-              <w:spacing w:line="220" w:lineRule="exact"/>
+              <w:spacing w:line="170" w:lineRule="exact" w:before="0" w:after="0"/>
             </w:pPr>
             <w:r/>
             <w:r>
+              <w:rPr>
+                <w:sz w:val="15"/>
+              </w:rPr>
               <w:t>9</w:t>
             </w:r>
           </w:p>
@@ -4297,10 +4505,13 @@
           <w:p>
             <w:pPr>
               <w:pStyle w:val="AppleTableBody"/>
-              <w:spacing w:line="220" w:lineRule="exact"/>
+              <w:spacing w:line="170" w:lineRule="exact" w:before="0" w:after="0"/>
             </w:pPr>
             <w:r/>
             <w:r>
+              <w:rPr>
+                <w:sz w:val="15"/>
+              </w:rPr>
               <w:t>R2</w:t>
             </w:r>
           </w:p>
@@ -4312,10 +4523,13 @@
           <w:p>
             <w:pPr>
               <w:pStyle w:val="AppleTableBody"/>
-              <w:spacing w:line="220" w:lineRule="exact"/>
+              <w:spacing w:line="170" w:lineRule="exact" w:before="0" w:after="0"/>
             </w:pPr>
             <w:r/>
             <w:r>
+              <w:rPr>
+                <w:sz w:val="15"/>
+              </w:rPr>
               <w:t>L-SW</w:t>
             </w:r>
           </w:p>
@@ -4327,10 +4541,13 @@
           <w:p>
             <w:pPr>
               <w:pStyle w:val="AppleTableBody"/>
-              <w:spacing w:line="220" w:lineRule="exact"/>
+              <w:spacing w:line="170" w:lineRule="exact" w:before="0" w:after="0"/>
             </w:pPr>
             <w:r/>
             <w:r>
+              <w:rPr>
+                <w:sz w:val="15"/>
+              </w:rPr>
               <w:t>下层</w:t>
             </w:r>
           </w:p>
@@ -4342,10 +4559,13 @@
           <w:p>
             <w:pPr>
               <w:pStyle w:val="AppleTableBody"/>
-              <w:spacing w:line="220" w:lineRule="exact"/>
+              <w:spacing w:line="170" w:lineRule="exact" w:before="0" w:after="0"/>
             </w:pPr>
             <w:r/>
             <w:r>
+              <w:rPr>
+                <w:sz w:val="15"/>
+              </w:rPr>
               <w:t>西南</w:t>
             </w:r>
           </w:p>
@@ -4357,10 +4577,13 @@
           <w:p>
             <w:pPr>
               <w:pStyle w:val="AppleTableBody"/>
-              <w:spacing w:line="220" w:lineRule="exact"/>
+              <w:spacing w:line="170" w:lineRule="exact" w:before="0" w:after="0"/>
             </w:pPr>
             <w:r/>
             <w:r>
+              <w:rPr>
+                <w:sz w:val="15"/>
+              </w:rPr>
               <w:t>29</w:t>
             </w:r>
           </w:p>
@@ -4372,10 +4595,13 @@
           <w:p>
             <w:pPr>
               <w:pStyle w:val="AppleTableBody"/>
-              <w:spacing w:line="220" w:lineRule="exact"/>
+              <w:spacing w:line="170" w:lineRule="exact" w:before="0" w:after="0"/>
             </w:pPr>
             <w:r/>
             <w:r>
+              <w:rPr>
+                <w:sz w:val="15"/>
+              </w:rPr>
               <w:t>28</w:t>
             </w:r>
           </w:p>
@@ -4387,10 +4613,13 @@
           <w:p>
             <w:pPr>
               <w:pStyle w:val="AppleTableBody"/>
-              <w:spacing w:line="220" w:lineRule="exact"/>
+              <w:spacing w:line="170" w:lineRule="exact" w:before="0" w:after="0"/>
             </w:pPr>
             <w:r/>
             <w:r>
+              <w:rPr>
+                <w:sz w:val="15"/>
+              </w:rPr>
               <w:t>28</w:t>
             </w:r>
           </w:p>
@@ -4402,10 +4631,13 @@
           <w:p>
             <w:pPr>
               <w:pStyle w:val="AppleTableBody"/>
-              <w:spacing w:line="220" w:lineRule="exact"/>
+              <w:spacing w:line="170" w:lineRule="exact" w:before="0" w:after="0"/>
             </w:pPr>
             <w:r/>
             <w:r>
+              <w:rPr>
+                <w:sz w:val="15"/>
+              </w:rPr>
               <w:t>28</w:t>
             </w:r>
           </w:p>
@@ -4417,10 +4649,13 @@
           <w:p>
             <w:pPr>
               <w:pStyle w:val="AppleTableBody"/>
-              <w:spacing w:line="220" w:lineRule="exact"/>
+              <w:spacing w:line="170" w:lineRule="exact" w:before="0" w:after="0"/>
             </w:pPr>
             <w:r/>
             <w:r>
+              <w:rPr>
+                <w:sz w:val="15"/>
+              </w:rPr>
               <w:t>113</w:t>
             </w:r>
           </w:p>
@@ -4432,10 +4667,13 @@
           <w:p>
             <w:pPr>
               <w:pStyle w:val="AppleTableBody"/>
-              <w:spacing w:line="220" w:lineRule="exact"/>
+              <w:spacing w:line="170" w:lineRule="exact" w:before="0" w:after="0"/>
             </w:pPr>
             <w:r/>
             <w:r>
+              <w:rPr>
+                <w:sz w:val="15"/>
+              </w:rPr>
               <w:t>10</w:t>
             </w:r>
           </w:p>
@@ -4452,10 +4690,13 @@
           <w:p>
             <w:pPr>
               <w:pStyle w:val="AppleTableBody"/>
-              <w:spacing w:line="220" w:lineRule="exact"/>
+              <w:spacing w:line="170" w:lineRule="exact" w:before="0" w:after="0"/>
             </w:pPr>
             <w:r/>
             <w:r>
+              <w:rPr>
+                <w:sz w:val="15"/>
+              </w:rPr>
               <w:t>R3</w:t>
             </w:r>
           </w:p>
@@ -4467,10 +4708,13 @@
           <w:p>
             <w:pPr>
               <w:pStyle w:val="AppleTableBody"/>
-              <w:spacing w:line="220" w:lineRule="exact"/>
+              <w:spacing w:line="170" w:lineRule="exact" w:before="0" w:after="0"/>
             </w:pPr>
             <w:r/>
             <w:r>
+              <w:rPr>
+                <w:sz w:val="15"/>
+              </w:rPr>
               <w:t>U-NE</w:t>
             </w:r>
           </w:p>
@@ -4482,10 +4726,13 @@
           <w:p>
             <w:pPr>
               <w:pStyle w:val="AppleTableBody"/>
-              <w:spacing w:line="220" w:lineRule="exact"/>
+              <w:spacing w:line="170" w:lineRule="exact" w:before="0" w:after="0"/>
             </w:pPr>
             <w:r/>
             <w:r>
+              <w:rPr>
+                <w:sz w:val="15"/>
+              </w:rPr>
               <w:t>上层</w:t>
             </w:r>
           </w:p>
@@ -4497,10 +4744,13 @@
           <w:p>
             <w:pPr>
               <w:pStyle w:val="AppleTableBody"/>
-              <w:spacing w:line="220" w:lineRule="exact"/>
+              <w:spacing w:line="170" w:lineRule="exact" w:before="0" w:after="0"/>
             </w:pPr>
             <w:r/>
             <w:r>
+              <w:rPr>
+                <w:sz w:val="15"/>
+              </w:rPr>
               <w:t>东北</w:t>
             </w:r>
           </w:p>
@@ -4512,10 +4762,13 @@
           <w:p>
             <w:pPr>
               <w:pStyle w:val="AppleTableBody"/>
-              <w:spacing w:line="220" w:lineRule="exact"/>
+              <w:spacing w:line="170" w:lineRule="exact" w:before="0" w:after="0"/>
             </w:pPr>
             <w:r/>
             <w:r>
+              <w:rPr>
+                <w:sz w:val="15"/>
+              </w:rPr>
               <w:t>16</w:t>
             </w:r>
           </w:p>
@@ -4527,10 +4780,13 @@
           <w:p>
             <w:pPr>
               <w:pStyle w:val="AppleTableBody"/>
-              <w:spacing w:line="220" w:lineRule="exact"/>
+              <w:spacing w:line="170" w:lineRule="exact" w:before="0" w:after="0"/>
             </w:pPr>
             <w:r/>
             <w:r>
+              <w:rPr>
+                <w:sz w:val="15"/>
+              </w:rPr>
               <w:t>16</w:t>
             </w:r>
           </w:p>
@@ -4542,10 +4798,13 @@
           <w:p>
             <w:pPr>
               <w:pStyle w:val="AppleTableBody"/>
-              <w:spacing w:line="220" w:lineRule="exact"/>
+              <w:spacing w:line="170" w:lineRule="exact" w:before="0" w:after="0"/>
             </w:pPr>
             <w:r/>
             <w:r>
+              <w:rPr>
+                <w:sz w:val="15"/>
+              </w:rPr>
               <w:t>16</w:t>
             </w:r>
           </w:p>
@@ -4557,10 +4816,13 @@
           <w:p>
             <w:pPr>
               <w:pStyle w:val="AppleTableBody"/>
-              <w:spacing w:line="220" w:lineRule="exact"/>
+              <w:spacing w:line="170" w:lineRule="exact" w:before="0" w:after="0"/>
             </w:pPr>
             <w:r/>
             <w:r>
+              <w:rPr>
+                <w:sz w:val="15"/>
+              </w:rPr>
               <w:t>16</w:t>
             </w:r>
           </w:p>
@@ -4572,10 +4834,13 @@
           <w:p>
             <w:pPr>
               <w:pStyle w:val="AppleTableBody"/>
-              <w:spacing w:line="220" w:lineRule="exact"/>
+              <w:spacing w:line="170" w:lineRule="exact" w:before="0" w:after="0"/>
             </w:pPr>
             <w:r/>
             <w:r>
+              <w:rPr>
+                <w:sz w:val="15"/>
+              </w:rPr>
               <w:t>64</w:t>
             </w:r>
           </w:p>
@@ -4587,10 +4852,13 @@
           <w:p>
             <w:pPr>
               <w:pStyle w:val="AppleTableBody"/>
-              <w:spacing w:line="220" w:lineRule="exact"/>
+              <w:spacing w:line="170" w:lineRule="exact" w:before="0" w:after="0"/>
             </w:pPr>
             <w:r/>
             <w:r>
+              <w:rPr>
+                <w:sz w:val="15"/>
+              </w:rPr>
               <w:t>31</w:t>
             </w:r>
           </w:p>
@@ -4607,10 +4875,13 @@
           <w:p>
             <w:pPr>
               <w:pStyle w:val="AppleTableBody"/>
-              <w:spacing w:line="220" w:lineRule="exact"/>
+              <w:spacing w:line="170" w:lineRule="exact" w:before="0" w:after="0"/>
             </w:pPr>
             <w:r/>
             <w:r>
+              <w:rPr>
+                <w:sz w:val="15"/>
+              </w:rPr>
               <w:t>R3</w:t>
             </w:r>
           </w:p>
@@ -4622,10 +4893,13 @@
           <w:p>
             <w:pPr>
               <w:pStyle w:val="AppleTableBody"/>
-              <w:spacing w:line="220" w:lineRule="exact"/>
+              <w:spacing w:line="170" w:lineRule="exact" w:before="0" w:after="0"/>
             </w:pPr>
             <w:r/>
             <w:r>
+              <w:rPr>
+                <w:sz w:val="15"/>
+              </w:rPr>
               <w:t>U-NW</w:t>
             </w:r>
           </w:p>
@@ -4637,10 +4911,13 @@
           <w:p>
             <w:pPr>
               <w:pStyle w:val="AppleTableBody"/>
-              <w:spacing w:line="220" w:lineRule="exact"/>
+              <w:spacing w:line="170" w:lineRule="exact" w:before="0" w:after="0"/>
             </w:pPr>
             <w:r/>
             <w:r>
+              <w:rPr>
+                <w:sz w:val="15"/>
+              </w:rPr>
               <w:t>上层</w:t>
             </w:r>
           </w:p>
@@ -4652,10 +4929,13 @@
           <w:p>
             <w:pPr>
               <w:pStyle w:val="AppleTableBody"/>
-              <w:spacing w:line="220" w:lineRule="exact"/>
+              <w:spacing w:line="170" w:lineRule="exact" w:before="0" w:after="0"/>
             </w:pPr>
             <w:r/>
             <w:r>
+              <w:rPr>
+                <w:sz w:val="15"/>
+              </w:rPr>
               <w:t>西北</w:t>
             </w:r>
           </w:p>
@@ -4667,10 +4947,13 @@
           <w:p>
             <w:pPr>
               <w:pStyle w:val="AppleTableBody"/>
-              <w:spacing w:line="220" w:lineRule="exact"/>
+              <w:spacing w:line="170" w:lineRule="exact" w:before="0" w:after="0"/>
             </w:pPr>
             <w:r/>
             <w:r>
+              <w:rPr>
+                <w:sz w:val="15"/>
+              </w:rPr>
               <w:t>17</w:t>
             </w:r>
           </w:p>
@@ -4682,10 +4965,13 @@
           <w:p>
             <w:pPr>
               <w:pStyle w:val="AppleTableBody"/>
-              <w:spacing w:line="220" w:lineRule="exact"/>
+              <w:spacing w:line="170" w:lineRule="exact" w:before="0" w:after="0"/>
             </w:pPr>
             <w:r/>
             <w:r>
+              <w:rPr>
+                <w:sz w:val="15"/>
+              </w:rPr>
               <w:t>17</w:t>
             </w:r>
           </w:p>
@@ -4697,10 +4983,13 @@
           <w:p>
             <w:pPr>
               <w:pStyle w:val="AppleTableBody"/>
-              <w:spacing w:line="220" w:lineRule="exact"/>
+              <w:spacing w:line="170" w:lineRule="exact" w:before="0" w:after="0"/>
             </w:pPr>
             <w:r/>
             <w:r>
+              <w:rPr>
+                <w:sz w:val="15"/>
+              </w:rPr>
               <w:t>16</w:t>
             </w:r>
           </w:p>
@@ -4712,10 +5001,13 @@
           <w:p>
             <w:pPr>
               <w:pStyle w:val="AppleTableBody"/>
-              <w:spacing w:line="220" w:lineRule="exact"/>
+              <w:spacing w:line="170" w:lineRule="exact" w:before="0" w:after="0"/>
             </w:pPr>
             <w:r/>
             <w:r>
+              <w:rPr>
+                <w:sz w:val="15"/>
+              </w:rPr>
               <w:t>17</w:t>
             </w:r>
           </w:p>
@@ -4727,10 +5019,13 @@
           <w:p>
             <w:pPr>
               <w:pStyle w:val="AppleTableBody"/>
-              <w:spacing w:line="220" w:lineRule="exact"/>
+              <w:spacing w:line="170" w:lineRule="exact" w:before="0" w:after="0"/>
             </w:pPr>
             <w:r/>
             <w:r>
+              <w:rPr>
+                <w:sz w:val="15"/>
+              </w:rPr>
               <w:t>67</w:t>
             </w:r>
           </w:p>
@@ -4742,10 +5037,13 @@
           <w:p>
             <w:pPr>
               <w:pStyle w:val="AppleTableBody"/>
-              <w:spacing w:line="220" w:lineRule="exact"/>
+              <w:spacing w:line="170" w:lineRule="exact" w:before="0" w:after="0"/>
             </w:pPr>
             <w:r/>
             <w:r>
+              <w:rPr>
+                <w:sz w:val="15"/>
+              </w:rPr>
               <w:t>33</w:t>
             </w:r>
           </w:p>
@@ -4762,10 +5060,13 @@
           <w:p>
             <w:pPr>
               <w:pStyle w:val="AppleTableBody"/>
-              <w:spacing w:line="220" w:lineRule="exact"/>
+              <w:spacing w:line="170" w:lineRule="exact" w:before="0" w:after="0"/>
             </w:pPr>
             <w:r/>
             <w:r>
+              <w:rPr>
+                <w:sz w:val="15"/>
+              </w:rPr>
               <w:t>R3</w:t>
             </w:r>
           </w:p>
@@ -4777,10 +5078,13 @@
           <w:p>
             <w:pPr>
               <w:pStyle w:val="AppleTableBody"/>
-              <w:spacing w:line="220" w:lineRule="exact"/>
+              <w:spacing w:line="170" w:lineRule="exact" w:before="0" w:after="0"/>
             </w:pPr>
             <w:r/>
             <w:r>
+              <w:rPr>
+                <w:sz w:val="15"/>
+              </w:rPr>
               <w:t>M-E</w:t>
             </w:r>
           </w:p>
@@ -4792,10 +5096,13 @@
           <w:p>
             <w:pPr>
               <w:pStyle w:val="AppleTableBody"/>
-              <w:spacing w:line="220" w:lineRule="exact"/>
+              <w:spacing w:line="170" w:lineRule="exact" w:before="0" w:after="0"/>
             </w:pPr>
             <w:r/>
             <w:r>
+              <w:rPr>
+                <w:sz w:val="15"/>
+              </w:rPr>
               <w:t>中层</w:t>
             </w:r>
           </w:p>
@@ -4807,10 +5114,13 @@
           <w:p>
             <w:pPr>
               <w:pStyle w:val="AppleTableBody"/>
-              <w:spacing w:line="220" w:lineRule="exact"/>
+              <w:spacing w:line="170" w:lineRule="exact" w:before="0" w:after="0"/>
             </w:pPr>
             <w:r/>
             <w:r>
+              <w:rPr>
+                <w:sz w:val="15"/>
+              </w:rPr>
               <w:t>东</w:t>
             </w:r>
           </w:p>
@@ -4822,10 +5132,13 @@
           <w:p>
             <w:pPr>
               <w:pStyle w:val="AppleTableBody"/>
-              <w:spacing w:line="220" w:lineRule="exact"/>
+              <w:spacing w:line="170" w:lineRule="exact" w:before="0" w:after="0"/>
             </w:pPr>
             <w:r/>
             <w:r>
+              <w:rPr>
+                <w:sz w:val="15"/>
+              </w:rPr>
               <w:t>25</w:t>
             </w:r>
           </w:p>
@@ -4837,10 +5150,13 @@
           <w:p>
             <w:pPr>
               <w:pStyle w:val="AppleTableBody"/>
-              <w:spacing w:line="220" w:lineRule="exact"/>
+              <w:spacing w:line="170" w:lineRule="exact" w:before="0" w:after="0"/>
             </w:pPr>
             <w:r/>
             <w:r>
+              <w:rPr>
+                <w:sz w:val="15"/>
+              </w:rPr>
               <w:t>24</w:t>
             </w:r>
           </w:p>
@@ -4852,10 +5168,13 @@
           <w:p>
             <w:pPr>
               <w:pStyle w:val="AppleTableBody"/>
-              <w:spacing w:line="220" w:lineRule="exact"/>
+              <w:spacing w:line="170" w:lineRule="exact" w:before="0" w:after="0"/>
             </w:pPr>
             <w:r/>
             <w:r>
+              <w:rPr>
+                <w:sz w:val="15"/>
+              </w:rPr>
               <w:t>25</w:t>
             </w:r>
           </w:p>
@@ -4867,10 +5186,13 @@
           <w:p>
             <w:pPr>
               <w:pStyle w:val="AppleTableBody"/>
-              <w:spacing w:line="220" w:lineRule="exact"/>
+              <w:spacing w:line="170" w:lineRule="exact" w:before="0" w:after="0"/>
             </w:pPr>
             <w:r/>
             <w:r>
+              <w:rPr>
+                <w:sz w:val="15"/>
+              </w:rPr>
               <w:t>24</w:t>
             </w:r>
           </w:p>
@@ -4882,10 +5204,13 @@
           <w:p>
             <w:pPr>
               <w:pStyle w:val="AppleTableBody"/>
-              <w:spacing w:line="220" w:lineRule="exact"/>
+              <w:spacing w:line="170" w:lineRule="exact" w:before="0" w:after="0"/>
             </w:pPr>
             <w:r/>
             <w:r>
+              <w:rPr>
+                <w:sz w:val="15"/>
+              </w:rPr>
               <w:t>98</w:t>
             </w:r>
           </w:p>
@@ -4897,10 +5222,13 @@
           <w:p>
             <w:pPr>
               <w:pStyle w:val="AppleTableBody"/>
-              <w:spacing w:line="220" w:lineRule="exact"/>
+              <w:spacing w:line="170" w:lineRule="exact" w:before="0" w:after="0"/>
             </w:pPr>
             <w:r/>
             <w:r>
+              <w:rPr>
+                <w:sz w:val="15"/>
+              </w:rPr>
               <w:t>3</w:t>
             </w:r>
           </w:p>
@@ -4917,10 +5245,13 @@
           <w:p>
             <w:pPr>
               <w:pStyle w:val="AppleTableBody"/>
-              <w:spacing w:line="220" w:lineRule="exact"/>
+              <w:spacing w:line="170" w:lineRule="exact" w:before="0" w:after="0"/>
             </w:pPr>
             <w:r/>
             <w:r>
+              <w:rPr>
+                <w:sz w:val="15"/>
+              </w:rPr>
               <w:t>R3</w:t>
             </w:r>
           </w:p>
@@ -4932,10 +5263,13 @@
           <w:p>
             <w:pPr>
               <w:pStyle w:val="AppleTableBody"/>
-              <w:spacing w:line="220" w:lineRule="exact"/>
+              <w:spacing w:line="170" w:lineRule="exact" w:before="0" w:after="0"/>
             </w:pPr>
             <w:r/>
             <w:r>
+              <w:rPr>
+                <w:sz w:val="15"/>
+              </w:rPr>
               <w:t>M-W</w:t>
             </w:r>
           </w:p>
@@ -4947,10 +5281,13 @@
           <w:p>
             <w:pPr>
               <w:pStyle w:val="AppleTableBody"/>
-              <w:spacing w:line="220" w:lineRule="exact"/>
+              <w:spacing w:line="170" w:lineRule="exact" w:before="0" w:after="0"/>
             </w:pPr>
             <w:r/>
             <w:r>
+              <w:rPr>
+                <w:sz w:val="15"/>
+              </w:rPr>
               <w:t>中层</w:t>
             </w:r>
           </w:p>
@@ -4962,10 +5299,13 @@
           <w:p>
             <w:pPr>
               <w:pStyle w:val="AppleTableBody"/>
-              <w:spacing w:line="220" w:lineRule="exact"/>
+              <w:spacing w:line="170" w:lineRule="exact" w:before="0" w:after="0"/>
             </w:pPr>
             <w:r/>
             <w:r>
+              <w:rPr>
+                <w:sz w:val="15"/>
+              </w:rPr>
               <w:t>西</w:t>
             </w:r>
           </w:p>
@@ -4977,10 +5317,13 @@
           <w:p>
             <w:pPr>
               <w:pStyle w:val="AppleTableBody"/>
-              <w:spacing w:line="220" w:lineRule="exact"/>
+              <w:spacing w:line="170" w:lineRule="exact" w:before="0" w:after="0"/>
             </w:pPr>
             <w:r/>
             <w:r>
+              <w:rPr>
+                <w:sz w:val="15"/>
+              </w:rPr>
               <w:t>25</w:t>
             </w:r>
           </w:p>
@@ -4992,10 +5335,13 @@
           <w:p>
             <w:pPr>
               <w:pStyle w:val="AppleTableBody"/>
-              <w:spacing w:line="220" w:lineRule="exact"/>
+              <w:spacing w:line="170" w:lineRule="exact" w:before="0" w:after="0"/>
             </w:pPr>
             <w:r/>
             <w:r>
+              <w:rPr>
+                <w:sz w:val="15"/>
+              </w:rPr>
               <w:t>25</w:t>
             </w:r>
           </w:p>
@@ -5007,10 +5353,13 @@
           <w:p>
             <w:pPr>
               <w:pStyle w:val="AppleTableBody"/>
-              <w:spacing w:line="220" w:lineRule="exact"/>
+              <w:spacing w:line="170" w:lineRule="exact" w:before="0" w:after="0"/>
             </w:pPr>
             <w:r/>
             <w:r>
+              <w:rPr>
+                <w:sz w:val="15"/>
+              </w:rPr>
               <w:t>25</w:t>
             </w:r>
           </w:p>
@@ -5022,10 +5371,13 @@
           <w:p>
             <w:pPr>
               <w:pStyle w:val="AppleTableBody"/>
-              <w:spacing w:line="220" w:lineRule="exact"/>
+              <w:spacing w:line="170" w:lineRule="exact" w:before="0" w:after="0"/>
             </w:pPr>
             <w:r/>
             <w:r>
+              <w:rPr>
+                <w:sz w:val="15"/>
+              </w:rPr>
               <w:t>25</w:t>
             </w:r>
           </w:p>
@@ -5037,10 +5389,13 @@
           <w:p>
             <w:pPr>
               <w:pStyle w:val="AppleTableBody"/>
-              <w:spacing w:line="220" w:lineRule="exact"/>
+              <w:spacing w:line="170" w:lineRule="exact" w:before="0" w:after="0"/>
             </w:pPr>
             <w:r/>
             <w:r>
+              <w:rPr>
+                <w:sz w:val="15"/>
+              </w:rPr>
               <w:t>100</w:t>
             </w:r>
           </w:p>
@@ -5052,10 +5407,13 @@
           <w:p>
             <w:pPr>
               <w:pStyle w:val="AppleTableBody"/>
-              <w:spacing w:line="220" w:lineRule="exact"/>
+              <w:spacing w:line="170" w:lineRule="exact" w:before="0" w:after="0"/>
             </w:pPr>
             <w:r/>
             <w:r>
+              <w:rPr>
+                <w:sz w:val="15"/>
+              </w:rPr>
               <w:t>4</w:t>
             </w:r>
           </w:p>
@@ -5072,10 +5430,13 @@
           <w:p>
             <w:pPr>
               <w:pStyle w:val="AppleTableBody"/>
-              <w:spacing w:line="220" w:lineRule="exact"/>
+              <w:spacing w:line="170" w:lineRule="exact" w:before="0" w:after="0"/>
             </w:pPr>
             <w:r/>
             <w:r>
+              <w:rPr>
+                <w:sz w:val="15"/>
+              </w:rPr>
               <w:t>R3</w:t>
             </w:r>
           </w:p>
@@ -5087,10 +5448,13 @@
           <w:p>
             <w:pPr>
               <w:pStyle w:val="AppleTableBody"/>
-              <w:spacing w:line="220" w:lineRule="exact"/>
+              <w:spacing w:line="170" w:lineRule="exact" w:before="0" w:after="0"/>
             </w:pPr>
             <w:r/>
             <w:r>
+              <w:rPr>
+                <w:sz w:val="15"/>
+              </w:rPr>
               <w:t>L-SE</w:t>
             </w:r>
           </w:p>
@@ -5102,10 +5466,13 @@
           <w:p>
             <w:pPr>
               <w:pStyle w:val="AppleTableBody"/>
-              <w:spacing w:line="220" w:lineRule="exact"/>
+              <w:spacing w:line="170" w:lineRule="exact" w:before="0" w:after="0"/>
             </w:pPr>
             <w:r/>
             <w:r>
+              <w:rPr>
+                <w:sz w:val="15"/>
+              </w:rPr>
               <w:t>下层</w:t>
             </w:r>
           </w:p>
@@ -5117,10 +5484,13 @@
           <w:p>
             <w:pPr>
               <w:pStyle w:val="AppleTableBody"/>
-              <w:spacing w:line="220" w:lineRule="exact"/>
+              <w:spacing w:line="170" w:lineRule="exact" w:before="0" w:after="0"/>
             </w:pPr>
             <w:r/>
             <w:r>
+              <w:rPr>
+                <w:sz w:val="15"/>
+              </w:rPr>
               <w:t>东南</w:t>
             </w:r>
           </w:p>
@@ -5132,10 +5502,13 @@
           <w:p>
             <w:pPr>
               <w:pStyle w:val="AppleTableBody"/>
-              <w:spacing w:line="220" w:lineRule="exact"/>
+              <w:spacing w:line="170" w:lineRule="exact" w:before="0" w:after="0"/>
             </w:pPr>
             <w:r/>
             <w:r>
+              <w:rPr>
+                <w:sz w:val="15"/>
+              </w:rPr>
               <w:t>31</w:t>
             </w:r>
           </w:p>
@@ -5147,10 +5520,13 @@
           <w:p>
             <w:pPr>
               <w:pStyle w:val="AppleTableBody"/>
-              <w:spacing w:line="220" w:lineRule="exact"/>
+              <w:spacing w:line="170" w:lineRule="exact" w:before="0" w:after="0"/>
             </w:pPr>
             <w:r/>
             <w:r>
+              <w:rPr>
+                <w:sz w:val="15"/>
+              </w:rPr>
               <w:t>31</w:t>
             </w:r>
           </w:p>
@@ -5162,10 +5538,13 @@
           <w:p>
             <w:pPr>
               <w:pStyle w:val="AppleTableBody"/>
-              <w:spacing w:line="220" w:lineRule="exact"/>
+              <w:spacing w:line="170" w:lineRule="exact" w:before="0" w:after="0"/>
             </w:pPr>
             <w:r/>
             <w:r>
+              <w:rPr>
+                <w:sz w:val="15"/>
+              </w:rPr>
               <w:t>30</w:t>
             </w:r>
           </w:p>
@@ -5177,10 +5556,13 @@
           <w:p>
             <w:pPr>
               <w:pStyle w:val="AppleTableBody"/>
-              <w:spacing w:line="220" w:lineRule="exact"/>
+              <w:spacing w:line="170" w:lineRule="exact" w:before="0" w:after="0"/>
             </w:pPr>
             <w:r/>
             <w:r>
+              <w:rPr>
+                <w:sz w:val="15"/>
+              </w:rPr>
               <w:t>31</w:t>
             </w:r>
           </w:p>
@@ -5192,10 +5574,13 @@
           <w:p>
             <w:pPr>
               <w:pStyle w:val="AppleTableBody"/>
-              <w:spacing w:line="220" w:lineRule="exact"/>
+              <w:spacing w:line="170" w:lineRule="exact" w:before="0" w:after="0"/>
             </w:pPr>
             <w:r/>
             <w:r>
+              <w:rPr>
+                <w:sz w:val="15"/>
+              </w:rPr>
               <w:t>123</w:t>
             </w:r>
           </w:p>
@@ -5207,10 +5592,13 @@
           <w:p>
             <w:pPr>
               <w:pStyle w:val="AppleTableBody"/>
-              <w:spacing w:line="220" w:lineRule="exact"/>
+              <w:spacing w:line="170" w:lineRule="exact" w:before="0" w:after="0"/>
             </w:pPr>
             <w:r/>
             <w:r>
+              <w:rPr>
+                <w:sz w:val="15"/>
+              </w:rPr>
               <w:t>12</w:t>
             </w:r>
           </w:p>
@@ -5227,10 +5615,13 @@
           <w:p>
             <w:pPr>
               <w:pStyle w:val="AppleTableBody"/>
-              <w:spacing w:line="220" w:lineRule="exact"/>
+              <w:spacing w:line="170" w:lineRule="exact" w:before="0" w:after="0"/>
             </w:pPr>
             <w:r/>
             <w:r>
+              <w:rPr>
+                <w:sz w:val="15"/>
+              </w:rPr>
               <w:t>R3</w:t>
             </w:r>
           </w:p>
@@ -5242,10 +5633,13 @@
           <w:p>
             <w:pPr>
               <w:pStyle w:val="AppleTableBody"/>
-              <w:spacing w:line="220" w:lineRule="exact"/>
+              <w:spacing w:line="170" w:lineRule="exact" w:before="0" w:after="0"/>
             </w:pPr>
             <w:r/>
             <w:r>
+              <w:rPr>
+                <w:sz w:val="15"/>
+              </w:rPr>
               <w:t>L-SW</w:t>
             </w:r>
           </w:p>
@@ -5257,10 +5651,13 @@
           <w:p>
             <w:pPr>
               <w:pStyle w:val="AppleTableBody"/>
-              <w:spacing w:line="220" w:lineRule="exact"/>
+              <w:spacing w:line="170" w:lineRule="exact" w:before="0" w:after="0"/>
             </w:pPr>
             <w:r/>
             <w:r>
+              <w:rPr>
+                <w:sz w:val="15"/>
+              </w:rPr>
               <w:t>下层</w:t>
             </w:r>
           </w:p>
@@ -5272,10 +5669,13 @@
           <w:p>
             <w:pPr>
               <w:pStyle w:val="AppleTableBody"/>
-              <w:spacing w:line="220" w:lineRule="exact"/>
+              <w:spacing w:line="170" w:lineRule="exact" w:before="0" w:after="0"/>
             </w:pPr>
             <w:r/>
             <w:r>
+              <w:rPr>
+                <w:sz w:val="15"/>
+              </w:rPr>
               <w:t>西南</w:t>
             </w:r>
           </w:p>
@@ -5287,10 +5687,13 @@
           <w:p>
             <w:pPr>
               <w:pStyle w:val="AppleTableBody"/>
-              <w:spacing w:line="220" w:lineRule="exact"/>
+              <w:spacing w:line="170" w:lineRule="exact" w:before="0" w:after="0"/>
             </w:pPr>
             <w:r/>
             <w:r>
+              <w:rPr>
+                <w:sz w:val="15"/>
+              </w:rPr>
               <w:t>32</w:t>
             </w:r>
           </w:p>
@@ -5302,10 +5705,13 @@
           <w:p>
             <w:pPr>
               <w:pStyle w:val="AppleTableBody"/>
-              <w:spacing w:line="220" w:lineRule="exact"/>
+              <w:spacing w:line="170" w:lineRule="exact" w:before="0" w:after="0"/>
             </w:pPr>
             <w:r/>
             <w:r>
+              <w:rPr>
+                <w:sz w:val="15"/>
+              </w:rPr>
               <w:t>32</w:t>
             </w:r>
           </w:p>
@@ -5317,10 +5723,13 @@
           <w:p>
             <w:pPr>
               <w:pStyle w:val="AppleTableBody"/>
-              <w:spacing w:line="220" w:lineRule="exact"/>
+              <w:spacing w:line="170" w:lineRule="exact" w:before="0" w:after="0"/>
             </w:pPr>
             <w:r/>
             <w:r>
+              <w:rPr>
+                <w:sz w:val="15"/>
+              </w:rPr>
               <w:t>31</w:t>
             </w:r>
           </w:p>
@@ -5332,10 +5741,13 @@
           <w:p>
             <w:pPr>
               <w:pStyle w:val="AppleTableBody"/>
-              <w:spacing w:line="220" w:lineRule="exact"/>
+              <w:spacing w:line="170" w:lineRule="exact" w:before="0" w:after="0"/>
             </w:pPr>
             <w:r/>
             <w:r>
+              <w:rPr>
+                <w:sz w:val="15"/>
+              </w:rPr>
               <w:t>32</w:t>
             </w:r>
           </w:p>
@@ -5347,10 +5759,13 @@
           <w:p>
             <w:pPr>
               <w:pStyle w:val="AppleTableBody"/>
-              <w:spacing w:line="220" w:lineRule="exact"/>
+              <w:spacing w:line="170" w:lineRule="exact" w:before="0" w:after="0"/>
             </w:pPr>
             <w:r/>
             <w:r>
+              <w:rPr>
+                <w:sz w:val="15"/>
+              </w:rPr>
               <w:t>127</w:t>
             </w:r>
           </w:p>
@@ -5362,10 +5777,13 @@
           <w:p>
             <w:pPr>
               <w:pStyle w:val="AppleTableBody"/>
-              <w:spacing w:line="220" w:lineRule="exact"/>
+              <w:spacing w:line="170" w:lineRule="exact" w:before="0" w:after="0"/>
             </w:pPr>
             <w:r/>
             <w:r>
+              <w:rPr>
+                <w:sz w:val="15"/>
+              </w:rPr>
               <w:t>13</w:t>
             </w:r>
           </w:p>
@@ -5454,10 +5872,13 @@
           <w:p>
             <w:pPr>
               <w:pStyle w:val="AppleTableBody"/>
-              <w:spacing w:line="220" w:lineRule="exact"/>
+              <w:spacing w:line="170" w:lineRule="exact" w:before="0" w:after="0"/>
             </w:pPr>
             <w:r/>
             <w:r>
+              <w:rPr>
+                <w:sz w:val="15"/>
+              </w:rPr>
               <w:t>输入</w:t>
             </w:r>
           </w:p>
@@ -5473,10 +5894,13 @@
           <w:p>
             <w:pPr>
               <w:pStyle w:val="AppleTableBody"/>
-              <w:spacing w:line="220" w:lineRule="exact"/>
+              <w:spacing w:line="170" w:lineRule="exact" w:before="0" w:after="0"/>
             </w:pPr>
             <w:r/>
             <w:r>
+              <w:rPr>
+                <w:sz w:val="15"/>
+              </w:rPr>
               <w:t>取值</w:t>
             </w:r>
           </w:p>
@@ -5493,10 +5917,13 @@
           <w:p>
             <w:pPr>
               <w:pStyle w:val="AppleTableBody"/>
-              <w:spacing w:line="220" w:lineRule="exact"/>
+              <w:spacing w:line="170" w:lineRule="exact" w:before="0" w:after="0"/>
             </w:pPr>
             <w:r/>
             <w:r>
+              <w:rPr>
+                <w:sz w:val="15"/>
+              </w:rPr>
               <w:t>单样方面积/m²</w:t>
             </w:r>
           </w:p>
@@ -5508,10 +5935,13 @@
           <w:p>
             <w:pPr>
               <w:pStyle w:val="AppleTableBody"/>
-              <w:spacing w:line="220" w:lineRule="exact"/>
+              <w:spacing w:line="170" w:lineRule="exact" w:before="0" w:after="0"/>
             </w:pPr>
             <w:r/>
             <w:r>
+              <w:rPr>
+                <w:sz w:val="15"/>
+              </w:rPr>
               <w:t>0.25</w:t>
             </w:r>
           </w:p>
@@ -5528,10 +5958,13 @@
           <w:p>
             <w:pPr>
               <w:pStyle w:val="AppleTableBody"/>
-              <w:spacing w:line="220" w:lineRule="exact"/>
+              <w:spacing w:line="170" w:lineRule="exact" w:before="0" w:after="0"/>
             </w:pPr>
             <w:r/>
             <w:r>
+              <w:rPr>
+                <w:sz w:val="15"/>
+              </w:rPr>
               <w:t>整株等效尺度/m²</w:t>
             </w:r>
           </w:p>
@@ -5543,10 +5976,13 @@
           <w:p>
             <w:pPr>
               <w:pStyle w:val="AppleTableBody"/>
-              <w:spacing w:line="220" w:lineRule="exact"/>
+              <w:spacing w:line="170" w:lineRule="exact" w:before="0" w:after="0"/>
             </w:pPr>
             <w:r/>
             <w:r>
+              <w:rPr>
+                <w:sz w:val="15"/>
+              </w:rPr>
               <w:t>11.004869</w:t>
             </w:r>
           </w:p>
@@ -5563,10 +5999,13 @@
           <w:p>
             <w:pPr>
               <w:pStyle w:val="AppleTableBody"/>
-              <w:spacing w:line="220" w:lineRule="exact"/>
+              <w:spacing w:line="170" w:lineRule="exact" w:before="0" w:after="0"/>
             </w:pPr>
             <w:r/>
             <w:r>
+              <w:rPr>
+                <w:sz w:val="15"/>
+              </w:rPr>
               <w:t>模拟真值/片</w:t>
             </w:r>
           </w:p>
@@ -5578,10 +6017,13 @@
           <w:p>
             <w:pPr>
               <w:pStyle w:val="AppleTableBody"/>
-              <w:spacing w:line="220" w:lineRule="exact"/>
+              <w:spacing w:line="170" w:lineRule="exact" w:before="0" w:after="0"/>
             </w:pPr>
             <w:r/>
             <w:r>
+              <w:rPr>
+                <w:sz w:val="15"/>
+              </w:rPr>
               <w:t>4320</w:t>
             </w:r>
           </w:p>
@@ -5598,10 +6040,13 @@
           <w:p>
             <w:pPr>
               <w:pStyle w:val="AppleTableBody"/>
-              <w:spacing w:line="220" w:lineRule="exact"/>
+              <w:spacing w:line="170" w:lineRule="exact" w:before="0" w:after="0"/>
             </w:pPr>
             <w:r/>
             <w:r>
+              <w:rPr>
+                <w:sz w:val="15"/>
+              </w:rPr>
               <w:t>上层权重/可见比例</w:t>
             </w:r>
           </w:p>
@@ -5613,10 +6058,13 @@
           <w:p>
             <w:pPr>
               <w:pStyle w:val="AppleTableBody"/>
-              <w:spacing w:line="220" w:lineRule="exact"/>
+              <w:spacing w:line="170" w:lineRule="exact" w:before="0" w:after="0"/>
             </w:pPr>
             <w:r/>
             <w:r>
+              <w:rPr>
+                <w:sz w:val="15"/>
+              </w:rPr>
               <w:t>权重 0.24 / 可见比例 0.91</w:t>
             </w:r>
           </w:p>
@@ -5633,10 +6081,13 @@
           <w:p>
             <w:pPr>
               <w:pStyle w:val="AppleTableBody"/>
-              <w:spacing w:line="220" w:lineRule="exact"/>
+              <w:spacing w:line="170" w:lineRule="exact" w:before="0" w:after="0"/>
             </w:pPr>
             <w:r/>
             <w:r>
+              <w:rPr>
+                <w:sz w:val="15"/>
+              </w:rPr>
               <w:t>中层权重/可见比例</w:t>
             </w:r>
           </w:p>
@@ -5648,10 +6099,13 @@
           <w:p>
             <w:pPr>
               <w:pStyle w:val="AppleTableBody"/>
-              <w:spacing w:line="220" w:lineRule="exact"/>
+              <w:spacing w:line="170" w:lineRule="exact" w:before="0" w:after="0"/>
             </w:pPr>
             <w:r/>
             <w:r>
+              <w:rPr>
+                <w:sz w:val="15"/>
+              </w:rPr>
               <w:t>权重 0.46 / 可见比例 0.82</w:t>
             </w:r>
           </w:p>
@@ -5668,10 +6122,13 @@
           <w:p>
             <w:pPr>
               <w:pStyle w:val="AppleTableBody"/>
-              <w:spacing w:line="220" w:lineRule="exact"/>
+              <w:spacing w:line="170" w:lineRule="exact" w:before="0" w:after="0"/>
             </w:pPr>
             <w:r/>
             <w:r>
+              <w:rPr>
+                <w:sz w:val="15"/>
+              </w:rPr>
               <w:t>下层权重/可见比例</w:t>
             </w:r>
           </w:p>
@@ -5683,10 +6140,13 @@
           <w:p>
             <w:pPr>
               <w:pStyle w:val="AppleTableBody"/>
-              <w:spacing w:line="220" w:lineRule="exact"/>
+              <w:spacing w:line="170" w:lineRule="exact" w:before="0" w:after="0"/>
             </w:pPr>
             <w:r/>
             <w:r>
+              <w:rPr>
+                <w:sz w:val="15"/>
+              </w:rPr>
               <w:t>权重 0.30 / 可见比例 0.88</w:t>
             </w:r>
           </w:p>
@@ -5703,10 +6163,13 @@
           <w:p>
             <w:pPr>
               <w:pStyle w:val="AppleTableBody"/>
-              <w:spacing w:line="220" w:lineRule="exact"/>
+              <w:spacing w:line="170" w:lineRule="exact" w:before="0" w:after="0"/>
             </w:pPr>
             <w:r/>
             <w:r>
+              <w:rPr>
+                <w:sz w:val="15"/>
+              </w:rPr>
               <w:t>变异系数标准差</w:t>
             </w:r>
           </w:p>
@@ -5718,10 +6181,13 @@
           <w:p>
             <w:pPr>
               <w:pStyle w:val="AppleTableBody"/>
-              <w:spacing w:line="220" w:lineRule="exact"/>
+              <w:spacing w:line="170" w:lineRule="exact" w:before="0" w:after="0"/>
             </w:pPr>
             <w:r/>
             <w:r>
+              <w:rPr>
+                <w:sz w:val="15"/>
+              </w:rPr>
               <w:t>样本标准差（n-1）</w:t>
             </w:r>
           </w:p>
@@ -5750,14 +6216,6 @@
       </w:pPr>
       <w:r>
         <w:t>致谢：感谢苹果大学虚构写作实验室提供纯属虚构的论文结构设定，感谢模拟果园方法讨论班对字段命名、图表可读性和复算顺序提出演示性建议。上述名称不指向任何真实人员或机构，也不存在真实资助、真实试验场地或真实参与者。本文全部内容由演示目的构造；对模拟数字、虚构参考文献和原创示意图的任何误用，均违背本论文的明确限制。</w:t>
-      </w:r>
-    </w:p>
-    <w:p>
-      <w:pPr>
-        <w:pStyle w:val="AppleBody"/>
-      </w:pPr>
-      <w:r>
-        <w:t>数据声明：本文的树体、叶片、样方、观测记录、统计结果和误差指标均为为演示论文排版而构造的模拟数据，不代表任何真实果园、真实机构、真实人员或实际科研结论，不得用于生产决策。</w:t>
       </w:r>
     </w:p>
     <w:sectPr>

</xml_diff>

<commit_message>
fix: isolate appendix headers and privacy contexts
Co-authored-by: Copilot App <223556219+Copilot@users.noreply.github.com>
</commit_message>
<xml_diff>
--- a/examples/after.docx
+++ b/examples/after.docx
@@ -6219,7 +6219,7 @@
       </w:r>
     </w:p>
     <w:sectPr>
-      <w:headerReference w:type="default" r:id="rId9"/>
+      <w:headerReference w:type="default" r:id="rId15"/>
       <w:footerReference w:type="default" r:id="rId10"/>
       <w:pgSz w:w="11906" w:h="16838"/>
       <w:pgMar w:top="1701" w:right="1701" w:bottom="1701" w:left="1701" w:header="1247" w:footer="1247" w:gutter="0"/>
@@ -6283,7 +6283,6 @@
 <w:hdr xmlns:m="http://schemas.openxmlformats.org/officeDocument/2006/math" xmlns:mc="http://schemas.openxmlformats.org/markup-compatibility/2006" xmlns:mo="http://schemas.microsoft.com/office/mac/office/2008/main" xmlns:mv="urn:schemas-microsoft-com:mac:vml" xmlns:o="urn:schemas-microsoft-com:office:office" xmlns:r="http://schemas.openxmlformats.org/officeDocument/2006/relationships" xmlns:v="urn:schemas-microsoft-com:vml" xmlns:w10="urn:schemas-microsoft-com:office:word" xmlns:w14="http://schemas.microsoft.com/office/word/2010/wordml" xmlns:w="http://schemas.openxmlformats.org/wordprocessingml/2006/main" xmlns:wne="http://schemas.microsoft.com/office/word/2006/wordml" xmlns:wp14="http://schemas.microsoft.com/office/word/2010/wordprocessingDrawing" xmlns:wp="http://schemas.openxmlformats.org/drawingml/2006/wordprocessingDrawing" xmlns:wpc="http://schemas.microsoft.com/office/word/2010/wordprocessingCanvas" xmlns:wpg="http://schemas.microsoft.com/office/word/2010/wordprocessingGroup" xmlns:wpi="http://schemas.microsoft.com/office/word/2010/wordprocessingInk" xmlns:wps="http://schemas.microsoft.com/office/word/2010/wordprocessingShape" mc:Ignorable="w14 wp14">
   <w:p>
     <w:pPr>
-      <w:pStyle w:val="AppleAppendixHeading"/>
       <w:jc w:val="center"/>
     </w:pPr>
     <w:r>
@@ -6297,21 +6296,6 @@
     </w:r>
     <w:r>
       <w:t>标题</w:t>
-    </w:r>
-    <w:r>
-      <w:fldChar w:fldCharType="end"/>
-    </w:r>
-    <w:r>
-      <w:fldChar w:fldCharType="begin" w:dirty="true"/>
-    </w:r>
-    <w:r>
-      <w:instrText xml:space="preserve"> STYLEREF "AppleAppendixHeading" </w:instrText>
-    </w:r>
-    <w:r>
-      <w:fldChar w:fldCharType="separate"/>
-    </w:r>
-    <w:r>
-      <w:t/>
     </w:r>
     <w:r>
       <w:fldChar w:fldCharType="end"/>

</xml_diff>